<commit_message>
feat: integrate bootstrap + emergency sensitivity into manuscripts and PPTX
Japanese manuscript (manuscript_strobe.docx):
- Methods: added bootstrap methodology (stratified, BCa) + emergency sensitivity description
- Results: Table 5 (emergency sensitivity), Table 6 (bootstrap), Fig. 8 (bootstrap comparison)
- Discussion: emergency effect modifier + bootstrap robustness findings

English manuscript (manuscript_strobe_en.docx):
- Same additions in English

PPTX (figures_strobe.pptx):
- Slide 8: Bootstrap comparison table (editable shapes)

Total: 8 figures, 6 tables, STROBE checklist in both manuscripts
Co-Authored-By: Tatsuki Onishi <bougtoir@gmail.com>
</commit_message>
<xml_diff>
--- a/yago_ionv/manuscript_strobe.docx
+++ b/yago_ionv/manuscript_strobe.docx
@@ -83,7 +83,7 @@
     </w:p>
     <w:p>
       <w:r>
-        <w:t>制吐薬（広義）によるIONV発生率は単胎群17.7%、双胎群17.0%であり有意差を認めなかった（調整済みオッズ比[aOR] 0.92, 95%信頼区間[CI] 0.67–1.27, P = 0.624）。一方、制吐薬（狭義：5-HT3拮抗薬）では単胎群0.9%に対し双胎群2.3%と有意に高率であった（aOR 3.18, 95%CI 1.38–7.36, P = 0.007）。共変量感度分析でも結果は頑健であった。</w:t>
+        <w:t>制吐薬（広義）によるIONV発生率は単胎群17.7%、双胎群17.0%であり有意差を認めなかった（調整済みオッズ比[aOR] 0.92, 95%信頼区間[CI] 0.67–1.27, P = 0.624）。一方、制吐薬（狭義：5-HT3拮抗薬）では単胎群0.9%に対し双胎群2.3%と有意に高率であった（aOR 3.18, 95%CI 1.38–7.36, P = 0.007）。共変量感度分析、緊急帝王切開の層別解析、および10,000回の層別ブートストラップ検証でも結果は頑健であった。</w:t>
       </w:r>
     </w:p>
     <w:p>
@@ -416,6 +416,27 @@
     </w:p>
     <w:p>
       <w:r>
+        <w:t>さらに、緊急帝王切開が効果修飾因子となりうるかを検証するため、予定手術のみ（緊急除外）、緊急手術のみのサブグループ解析を実施した。また、緊急帝王切開と双胎の交互作用項をモデルに追加した交互作用解析も行った。</w:t>
+      </w:r>
+    </w:p>
+    <w:p>
+      <w:pPr>
+        <w:pStyle w:val="Heading2"/>
+      </w:pPr>
+      <w:r>
+        <w:rPr>
+          <w:color w:val="000000"/>
+        </w:rPr>
+        <w:t>ブートストラップ検証（STROBE項目13）</w:t>
+      </w:r>
+    </w:p>
+    <w:p>
+      <w:r>
+        <w:t>単胎・双胎間の症例数比が約8:1と不均衡であったため、ロジスティック回帰の信頼区間推定の頑健性を検証する目的で層別ブートストラップ法を実施した。各リサンプルにおいて単胎群と双胎群を別々にリサンプリングした後に結合し、群比率を維持した（層別リサンプリング）。10,000回のリサンプリングを行い、パーセンタイル法およびBCa法（bias-corrected and accelerated）による95%信頼区間を算出した。BCa法のバイアス補正因子z0はブートストラップ分布の中央値偏差から、加速度因子aはジャックナイフ法により推定した。</w:t>
+      </w:r>
+    </w:p>
+    <w:p>
+      <w:r>
         <w:t>統計解析はPython 3.12（scipy 1.14, statsmodels 0.14）を用い、有意水準は両側5%とした。</w:t>
       </w:r>
     </w:p>
@@ -3751,6 +3772,1720 @@
       </w:r>
     </w:p>
     <w:p>
+      <w:pPr>
+        <w:pStyle w:val="Heading2"/>
+      </w:pPr>
+      <w:r>
+        <w:rPr>
+          <w:color w:val="000000"/>
+        </w:rPr>
+        <w:t>緊急帝王切開の感度分析（STROBE項目18）</w:t>
+      </w:r>
+    </w:p>
+    <w:p>
+      <w:r>
+        <w:t>緊急帝王切開が双胎のIONV効果を修飾する可能性を検証するため、予定手術のみ（n=1,736、単胎1,515例、双胎221例）および緊急手術のみ（n=1,452、単胎1,331例、双胎121例）のサブグループ解析を実施した（Table 5）。</w:t>
+      </w:r>
+    </w:p>
+    <w:p>
+      <w:r>
+        <w:t>予定手術のみでは、制吐薬（狭義）主要評価項目でaOR 8.99（95%CI 2.50–32.29, P &lt; 0.001）と効果量が大幅に増大し、副次評価項目も有意となった（aOR 8.39, 95%CI 1.21–58.18, P = 0.031）。一方、緊急手術のみでは双胎効果は完全に消失した（狭義主要 aOR 0.95, P = 0.958）。</w:t>
+      </w:r>
+    </w:p>
+    <w:p>
+      <w:r>
+        <w:t>興味深いことに、予定手術のみでは制吐薬（広義）主要評価項目で双胎群の方が有意に低率であった（18.5% vs 14.0%, aOR 0.64, P = 0.047）。交互作用解析では、制吐薬（広義）主要評価項目で緊急×双胎の有意な交互作用を認めた（交互作用OR 2.05, P = 0.023）。</w:t>
+      </w:r>
+    </w:p>
+    <w:p>
+      <w:r>
+        <w:rPr>
+          <w:b/>
+        </w:rPr>
+        <w:t>Table 5. 緊急帝王切開の感度分析</w:t>
+      </w:r>
+    </w:p>
+    <w:tbl>
+      <w:tblPr>
+        <w:tblStyle w:val="LightShading-Accent1"/>
+        <w:tblW w:type="auto" w:w="0"/>
+        <w:jc w:val="center"/>
+        <w:tblLook w:firstColumn="1" w:firstRow="1" w:lastColumn="0" w:lastRow="0" w:noHBand="0" w:noVBand="1" w:val="04A0"/>
+      </w:tblPr>
+      <w:tblGrid>
+        <w:gridCol w:w="1234"/>
+        <w:gridCol w:w="1234"/>
+        <w:gridCol w:w="1234"/>
+        <w:gridCol w:w="1234"/>
+        <w:gridCol w:w="1234"/>
+        <w:gridCol w:w="1234"/>
+        <w:gridCol w:w="1234"/>
+      </w:tblGrid>
+      <w:tr>
+        <w:tc>
+          <w:tcPr>
+            <w:tcW w:type="dxa" w:w="1234"/>
+          </w:tcPr>
+          <w:p>
+            <w:r>
+              <w:rPr>
+                <w:b/>
+                <w:sz w:val="16"/>
+              </w:rPr>
+              <w:t>サブグループ</w:t>
+            </w:r>
+          </w:p>
+        </w:tc>
+        <w:tc>
+          <w:tcPr>
+            <w:tcW w:type="dxa" w:w="1234"/>
+          </w:tcPr>
+          <w:p>
+            <w:r>
+              <w:rPr>
+                <w:b/>
+                <w:sz w:val="16"/>
+              </w:rPr>
+              <w:t>評価項目</w:t>
+            </w:r>
+          </w:p>
+        </w:tc>
+        <w:tc>
+          <w:tcPr>
+            <w:tcW w:type="dxa" w:w="1234"/>
+          </w:tcPr>
+          <w:p>
+            <w:r>
+              <w:rPr>
+                <w:b/>
+                <w:sz w:val="16"/>
+              </w:rPr>
+              <w:t>単胎</w:t>
+            </w:r>
+          </w:p>
+        </w:tc>
+        <w:tc>
+          <w:tcPr>
+            <w:tcW w:type="dxa" w:w="1234"/>
+          </w:tcPr>
+          <w:p>
+            <w:r>
+              <w:rPr>
+                <w:b/>
+                <w:sz w:val="16"/>
+              </w:rPr>
+              <w:t>双胎</w:t>
+            </w:r>
+          </w:p>
+        </w:tc>
+        <w:tc>
+          <w:tcPr>
+            <w:tcW w:type="dxa" w:w="1234"/>
+          </w:tcPr>
+          <w:p>
+            <w:r>
+              <w:rPr>
+                <w:b/>
+                <w:sz w:val="16"/>
+              </w:rPr>
+              <w:t>aOR</w:t>
+            </w:r>
+          </w:p>
+        </w:tc>
+        <w:tc>
+          <w:tcPr>
+            <w:tcW w:type="dxa" w:w="1234"/>
+          </w:tcPr>
+          <w:p>
+            <w:r>
+              <w:rPr>
+                <w:b/>
+                <w:sz w:val="16"/>
+              </w:rPr>
+              <w:t>95% CI</w:t>
+            </w:r>
+          </w:p>
+        </w:tc>
+        <w:tc>
+          <w:tcPr>
+            <w:tcW w:type="dxa" w:w="1234"/>
+          </w:tcPr>
+          <w:p>
+            <w:r>
+              <w:rPr>
+                <w:b/>
+                <w:sz w:val="16"/>
+              </w:rPr>
+              <w:t>P値</w:t>
+            </w:r>
+          </w:p>
+        </w:tc>
+      </w:tr>
+      <w:tr>
+        <w:tc>
+          <w:tcPr>
+            <w:tcW w:type="dxa" w:w="1234"/>
+          </w:tcPr>
+          <w:p>
+            <w:r>
+              <w:rPr>
+                <w:sz w:val="16"/>
+              </w:rPr>
+              <w:t>予定手術のみ</w:t>
+            </w:r>
+          </w:p>
+        </w:tc>
+        <w:tc>
+          <w:tcPr>
+            <w:tcW w:type="dxa" w:w="1234"/>
+          </w:tcPr>
+          <w:p>
+            <w:r>
+              <w:rPr>
+                <w:sz w:val="16"/>
+              </w:rPr>
+              <w:t>広義 主要</w:t>
+            </w:r>
+          </w:p>
+        </w:tc>
+        <w:tc>
+          <w:tcPr>
+            <w:tcW w:type="dxa" w:w="1234"/>
+          </w:tcPr>
+          <w:p>
+            <w:r>
+              <w:rPr>
+                <w:sz w:val="16"/>
+              </w:rPr>
+              <w:t>18.5%</w:t>
+            </w:r>
+          </w:p>
+        </w:tc>
+        <w:tc>
+          <w:tcPr>
+            <w:tcW w:type="dxa" w:w="1234"/>
+          </w:tcPr>
+          <w:p>
+            <w:r>
+              <w:rPr>
+                <w:sz w:val="16"/>
+              </w:rPr>
+              <w:t>14.0%</w:t>
+            </w:r>
+          </w:p>
+        </w:tc>
+        <w:tc>
+          <w:tcPr>
+            <w:tcW w:type="dxa" w:w="1234"/>
+          </w:tcPr>
+          <w:p>
+            <w:r>
+              <w:rPr>
+                <w:sz w:val="16"/>
+              </w:rPr>
+              <w:t>0.64</w:t>
+            </w:r>
+          </w:p>
+        </w:tc>
+        <w:tc>
+          <w:tcPr>
+            <w:tcW w:type="dxa" w:w="1234"/>
+          </w:tcPr>
+          <w:p>
+            <w:r>
+              <w:rPr>
+                <w:sz w:val="16"/>
+              </w:rPr>
+              <w:t>0.41–0.99</w:t>
+            </w:r>
+          </w:p>
+        </w:tc>
+        <w:tc>
+          <w:tcPr>
+            <w:tcW w:type="dxa" w:w="1234"/>
+          </w:tcPr>
+          <w:p>
+            <w:r>
+              <w:rPr>
+                <w:sz w:val="16"/>
+              </w:rPr>
+              <w:t>0.047</w:t>
+            </w:r>
+          </w:p>
+        </w:tc>
+      </w:tr>
+      <w:tr>
+        <w:tc>
+          <w:tcPr>
+            <w:tcW w:type="dxa" w:w="1234"/>
+          </w:tcPr>
+          <w:p>
+            <w:r>
+              <w:rPr>
+                <w:sz w:val="16"/>
+              </w:rPr>
+            </w:r>
+          </w:p>
+        </w:tc>
+        <w:tc>
+          <w:tcPr>
+            <w:tcW w:type="dxa" w:w="1234"/>
+          </w:tcPr>
+          <w:p>
+            <w:r>
+              <w:rPr>
+                <w:sz w:val="16"/>
+              </w:rPr>
+              <w:t>広義 副次</w:t>
+            </w:r>
+          </w:p>
+        </w:tc>
+        <w:tc>
+          <w:tcPr>
+            <w:tcW w:type="dxa" w:w="1234"/>
+          </w:tcPr>
+          <w:p>
+            <w:r>
+              <w:rPr>
+                <w:sz w:val="16"/>
+              </w:rPr>
+              <w:t>2.4%</w:t>
+            </w:r>
+          </w:p>
+        </w:tc>
+        <w:tc>
+          <w:tcPr>
+            <w:tcW w:type="dxa" w:w="1234"/>
+          </w:tcPr>
+          <w:p>
+            <w:r>
+              <w:rPr>
+                <w:sz w:val="16"/>
+              </w:rPr>
+              <w:t>1.8%</w:t>
+            </w:r>
+          </w:p>
+        </w:tc>
+        <w:tc>
+          <w:tcPr>
+            <w:tcW w:type="dxa" w:w="1234"/>
+          </w:tcPr>
+          <w:p>
+            <w:r>
+              <w:rPr>
+                <w:sz w:val="16"/>
+              </w:rPr>
+              <w:t>0.83</w:t>
+            </w:r>
+          </w:p>
+        </w:tc>
+        <w:tc>
+          <w:tcPr>
+            <w:tcW w:type="dxa" w:w="1234"/>
+          </w:tcPr>
+          <w:p>
+            <w:r>
+              <w:rPr>
+                <w:sz w:val="16"/>
+              </w:rPr>
+              <w:t>0.28–2.47</w:t>
+            </w:r>
+          </w:p>
+        </w:tc>
+        <w:tc>
+          <w:tcPr>
+            <w:tcW w:type="dxa" w:w="1234"/>
+          </w:tcPr>
+          <w:p>
+            <w:r>
+              <w:rPr>
+                <w:sz w:val="16"/>
+              </w:rPr>
+              <w:t>0.735</w:t>
+            </w:r>
+          </w:p>
+        </w:tc>
+      </w:tr>
+      <w:tr>
+        <w:tc>
+          <w:tcPr>
+            <w:tcW w:type="dxa" w:w="1234"/>
+          </w:tcPr>
+          <w:p>
+            <w:r>
+              <w:rPr>
+                <w:sz w:val="16"/>
+              </w:rPr>
+            </w:r>
+          </w:p>
+        </w:tc>
+        <w:tc>
+          <w:tcPr>
+            <w:tcW w:type="dxa" w:w="1234"/>
+          </w:tcPr>
+          <w:p>
+            <w:r>
+              <w:rPr>
+                <w:sz w:val="16"/>
+              </w:rPr>
+              <w:t>狭義 主要</w:t>
+            </w:r>
+          </w:p>
+        </w:tc>
+        <w:tc>
+          <w:tcPr>
+            <w:tcW w:type="dxa" w:w="1234"/>
+          </w:tcPr>
+          <w:p>
+            <w:r>
+              <w:rPr>
+                <w:sz w:val="16"/>
+              </w:rPr>
+              <w:t>0.8%</w:t>
+            </w:r>
+          </w:p>
+        </w:tc>
+        <w:tc>
+          <w:tcPr>
+            <w:tcW w:type="dxa" w:w="1234"/>
+          </w:tcPr>
+          <w:p>
+            <w:r>
+              <w:rPr>
+                <w:sz w:val="16"/>
+              </w:rPr>
+              <w:t>3.2%</w:t>
+            </w:r>
+          </w:p>
+        </w:tc>
+        <w:tc>
+          <w:tcPr>
+            <w:tcW w:type="dxa" w:w="1234"/>
+          </w:tcPr>
+          <w:p>
+            <w:r>
+              <w:rPr>
+                <w:sz w:val="16"/>
+              </w:rPr>
+              <w:t>8.99</w:t>
+            </w:r>
+          </w:p>
+        </w:tc>
+        <w:tc>
+          <w:tcPr>
+            <w:tcW w:type="dxa" w:w="1234"/>
+          </w:tcPr>
+          <w:p>
+            <w:r>
+              <w:rPr>
+                <w:sz w:val="16"/>
+              </w:rPr>
+              <w:t>2.50–32.29</w:t>
+            </w:r>
+          </w:p>
+        </w:tc>
+        <w:tc>
+          <w:tcPr>
+            <w:tcW w:type="dxa" w:w="1234"/>
+          </w:tcPr>
+          <w:p>
+            <w:r>
+              <w:rPr>
+                <w:sz w:val="16"/>
+              </w:rPr>
+              <w:t>&lt; 0.001</w:t>
+            </w:r>
+          </w:p>
+        </w:tc>
+      </w:tr>
+      <w:tr>
+        <w:tc>
+          <w:tcPr>
+            <w:tcW w:type="dxa" w:w="1234"/>
+          </w:tcPr>
+          <w:p>
+            <w:r>
+              <w:rPr>
+                <w:sz w:val="16"/>
+              </w:rPr>
+            </w:r>
+          </w:p>
+        </w:tc>
+        <w:tc>
+          <w:tcPr>
+            <w:tcW w:type="dxa" w:w="1234"/>
+          </w:tcPr>
+          <w:p>
+            <w:r>
+              <w:rPr>
+                <w:sz w:val="16"/>
+              </w:rPr>
+              <w:t>狭義 副次</w:t>
+            </w:r>
+          </w:p>
+        </w:tc>
+        <w:tc>
+          <w:tcPr>
+            <w:tcW w:type="dxa" w:w="1234"/>
+          </w:tcPr>
+          <w:p>
+            <w:r>
+              <w:rPr>
+                <w:sz w:val="16"/>
+              </w:rPr>
+              <w:t>0.3%</w:t>
+            </w:r>
+          </w:p>
+        </w:tc>
+        <w:tc>
+          <w:tcPr>
+            <w:tcW w:type="dxa" w:w="1234"/>
+          </w:tcPr>
+          <w:p>
+            <w:r>
+              <w:rPr>
+                <w:sz w:val="16"/>
+              </w:rPr>
+              <w:t>1.4%</w:t>
+            </w:r>
+          </w:p>
+        </w:tc>
+        <w:tc>
+          <w:tcPr>
+            <w:tcW w:type="dxa" w:w="1234"/>
+          </w:tcPr>
+          <w:p>
+            <w:r>
+              <w:rPr>
+                <w:sz w:val="16"/>
+              </w:rPr>
+              <w:t>8.39</w:t>
+            </w:r>
+          </w:p>
+        </w:tc>
+        <w:tc>
+          <w:tcPr>
+            <w:tcW w:type="dxa" w:w="1234"/>
+          </w:tcPr>
+          <w:p>
+            <w:r>
+              <w:rPr>
+                <w:sz w:val="16"/>
+              </w:rPr>
+              <w:t>1.21–58.18</w:t>
+            </w:r>
+          </w:p>
+        </w:tc>
+        <w:tc>
+          <w:tcPr>
+            <w:tcW w:type="dxa" w:w="1234"/>
+          </w:tcPr>
+          <w:p>
+            <w:r>
+              <w:rPr>
+                <w:sz w:val="16"/>
+              </w:rPr>
+              <w:t>0.031</w:t>
+            </w:r>
+          </w:p>
+        </w:tc>
+      </w:tr>
+      <w:tr>
+        <w:tc>
+          <w:tcPr>
+            <w:tcW w:type="dxa" w:w="1234"/>
+          </w:tcPr>
+          <w:p>
+            <w:r>
+              <w:rPr>
+                <w:sz w:val="16"/>
+              </w:rPr>
+              <w:t>緊急手術のみ</w:t>
+            </w:r>
+          </w:p>
+        </w:tc>
+        <w:tc>
+          <w:tcPr>
+            <w:tcW w:type="dxa" w:w="1234"/>
+          </w:tcPr>
+          <w:p>
+            <w:r>
+              <w:rPr>
+                <w:sz w:val="16"/>
+              </w:rPr>
+              <w:t>広義 主要</w:t>
+            </w:r>
+          </w:p>
+        </w:tc>
+        <w:tc>
+          <w:tcPr>
+            <w:tcW w:type="dxa" w:w="1234"/>
+          </w:tcPr>
+          <w:p>
+            <w:r>
+              <w:rPr>
+                <w:sz w:val="16"/>
+              </w:rPr>
+              <w:t>16.8%</w:t>
+            </w:r>
+          </w:p>
+        </w:tc>
+        <w:tc>
+          <w:tcPr>
+            <w:tcW w:type="dxa" w:w="1234"/>
+          </w:tcPr>
+          <w:p>
+            <w:r>
+              <w:rPr>
+                <w:sz w:val="16"/>
+              </w:rPr>
+              <w:t>22.3%</w:t>
+            </w:r>
+          </w:p>
+        </w:tc>
+        <w:tc>
+          <w:tcPr>
+            <w:tcW w:type="dxa" w:w="1234"/>
+          </w:tcPr>
+          <w:p>
+            <w:r>
+              <w:rPr>
+                <w:sz w:val="16"/>
+              </w:rPr>
+              <w:t>1.44</w:t>
+            </w:r>
+          </w:p>
+        </w:tc>
+        <w:tc>
+          <w:tcPr>
+            <w:tcW w:type="dxa" w:w="1234"/>
+          </w:tcPr>
+          <w:p>
+            <w:r>
+              <w:rPr>
+                <w:sz w:val="16"/>
+              </w:rPr>
+              <w:t>0.91–2.29</w:t>
+            </w:r>
+          </w:p>
+        </w:tc>
+        <w:tc>
+          <w:tcPr>
+            <w:tcW w:type="dxa" w:w="1234"/>
+          </w:tcPr>
+          <w:p>
+            <w:r>
+              <w:rPr>
+                <w:sz w:val="16"/>
+              </w:rPr>
+              <w:t>0.119</w:t>
+            </w:r>
+          </w:p>
+        </w:tc>
+      </w:tr>
+      <w:tr>
+        <w:tc>
+          <w:tcPr>
+            <w:tcW w:type="dxa" w:w="1234"/>
+          </w:tcPr>
+          <w:p>
+            <w:r>
+              <w:rPr>
+                <w:sz w:val="16"/>
+              </w:rPr>
+            </w:r>
+          </w:p>
+        </w:tc>
+        <w:tc>
+          <w:tcPr>
+            <w:tcW w:type="dxa" w:w="1234"/>
+          </w:tcPr>
+          <w:p>
+            <w:r>
+              <w:rPr>
+                <w:sz w:val="16"/>
+              </w:rPr>
+              <w:t>広義 副次</w:t>
+            </w:r>
+          </w:p>
+        </w:tc>
+        <w:tc>
+          <w:tcPr>
+            <w:tcW w:type="dxa" w:w="1234"/>
+          </w:tcPr>
+          <w:p>
+            <w:r>
+              <w:rPr>
+                <w:sz w:val="16"/>
+              </w:rPr>
+              <w:t>1.4%</w:t>
+            </w:r>
+          </w:p>
+        </w:tc>
+        <w:tc>
+          <w:tcPr>
+            <w:tcW w:type="dxa" w:w="1234"/>
+          </w:tcPr>
+          <w:p>
+            <w:r>
+              <w:rPr>
+                <w:sz w:val="16"/>
+              </w:rPr>
+              <w:t>0.8%</w:t>
+            </w:r>
+          </w:p>
+        </w:tc>
+        <w:tc>
+          <w:tcPr>
+            <w:tcW w:type="dxa" w:w="1234"/>
+          </w:tcPr>
+          <w:p>
+            <w:r>
+              <w:rPr>
+                <w:sz w:val="16"/>
+              </w:rPr>
+              <w:t>0.61</w:t>
+            </w:r>
+          </w:p>
+        </w:tc>
+        <w:tc>
+          <w:tcPr>
+            <w:tcW w:type="dxa" w:w="1234"/>
+          </w:tcPr>
+          <w:p>
+            <w:r>
+              <w:rPr>
+                <w:sz w:val="16"/>
+              </w:rPr>
+              <w:t>0.08–4.68</w:t>
+            </w:r>
+          </w:p>
+        </w:tc>
+        <w:tc>
+          <w:tcPr>
+            <w:tcW w:type="dxa" w:w="1234"/>
+          </w:tcPr>
+          <w:p>
+            <w:r>
+              <w:rPr>
+                <w:sz w:val="16"/>
+              </w:rPr>
+              <w:t>0.637</w:t>
+            </w:r>
+          </w:p>
+        </w:tc>
+      </w:tr>
+      <w:tr>
+        <w:tc>
+          <w:tcPr>
+            <w:tcW w:type="dxa" w:w="1234"/>
+          </w:tcPr>
+          <w:p>
+            <w:r>
+              <w:rPr>
+                <w:sz w:val="16"/>
+              </w:rPr>
+            </w:r>
+          </w:p>
+        </w:tc>
+        <w:tc>
+          <w:tcPr>
+            <w:tcW w:type="dxa" w:w="1234"/>
+          </w:tcPr>
+          <w:p>
+            <w:r>
+              <w:rPr>
+                <w:sz w:val="16"/>
+              </w:rPr>
+              <w:t>狭義 主要</w:t>
+            </w:r>
+          </w:p>
+        </w:tc>
+        <w:tc>
+          <w:tcPr>
+            <w:tcW w:type="dxa" w:w="1234"/>
+          </w:tcPr>
+          <w:p>
+            <w:r>
+              <w:rPr>
+                <w:sz w:val="16"/>
+              </w:rPr>
+              <w:t>1.0%</w:t>
+            </w:r>
+          </w:p>
+        </w:tc>
+        <w:tc>
+          <w:tcPr>
+            <w:tcW w:type="dxa" w:w="1234"/>
+          </w:tcPr>
+          <w:p>
+            <w:r>
+              <w:rPr>
+                <w:sz w:val="16"/>
+              </w:rPr>
+              <w:t>0.8%</w:t>
+            </w:r>
+          </w:p>
+        </w:tc>
+        <w:tc>
+          <w:tcPr>
+            <w:tcW w:type="dxa" w:w="1234"/>
+          </w:tcPr>
+          <w:p>
+            <w:r>
+              <w:rPr>
+                <w:sz w:val="16"/>
+              </w:rPr>
+              <w:t>0.95</w:t>
+            </w:r>
+          </w:p>
+        </w:tc>
+        <w:tc>
+          <w:tcPr>
+            <w:tcW w:type="dxa" w:w="1234"/>
+          </w:tcPr>
+          <w:p>
+            <w:r>
+              <w:rPr>
+                <w:sz w:val="16"/>
+              </w:rPr>
+              <w:t>0.12–7.44</w:t>
+            </w:r>
+          </w:p>
+        </w:tc>
+        <w:tc>
+          <w:tcPr>
+            <w:tcW w:type="dxa" w:w="1234"/>
+          </w:tcPr>
+          <w:p>
+            <w:r>
+              <w:rPr>
+                <w:sz w:val="16"/>
+              </w:rPr>
+              <w:t>0.958</w:t>
+            </w:r>
+          </w:p>
+        </w:tc>
+      </w:tr>
+      <w:tr>
+        <w:tc>
+          <w:tcPr>
+            <w:tcW w:type="dxa" w:w="1234"/>
+          </w:tcPr>
+          <w:p>
+            <w:r>
+              <w:rPr>
+                <w:sz w:val="16"/>
+              </w:rPr>
+            </w:r>
+          </w:p>
+        </w:tc>
+        <w:tc>
+          <w:tcPr>
+            <w:tcW w:type="dxa" w:w="1234"/>
+          </w:tcPr>
+          <w:p>
+            <w:r>
+              <w:rPr>
+                <w:sz w:val="16"/>
+              </w:rPr>
+              <w:t>狭義 副次</w:t>
+            </w:r>
+          </w:p>
+        </w:tc>
+        <w:tc>
+          <w:tcPr>
+            <w:tcW w:type="dxa" w:w="1234"/>
+          </w:tcPr>
+          <w:p>
+            <w:r>
+              <w:rPr>
+                <w:sz w:val="16"/>
+              </w:rPr>
+              <w:t>0.1%</w:t>
+            </w:r>
+          </w:p>
+        </w:tc>
+        <w:tc>
+          <w:tcPr>
+            <w:tcW w:type="dxa" w:w="1234"/>
+          </w:tcPr>
+          <w:p>
+            <w:r>
+              <w:rPr>
+                <w:sz w:val="16"/>
+              </w:rPr>
+              <w:t>0.0%</w:t>
+            </w:r>
+          </w:p>
+        </w:tc>
+        <w:tc>
+          <w:tcPr>
+            <w:tcW w:type="dxa" w:w="1234"/>
+          </w:tcPr>
+          <w:p>
+            <w:r>
+              <w:rPr>
+                <w:sz w:val="16"/>
+              </w:rPr>
+              <w:t>—</w:t>
+            </w:r>
+          </w:p>
+        </w:tc>
+        <w:tc>
+          <w:tcPr>
+            <w:tcW w:type="dxa" w:w="1234"/>
+          </w:tcPr>
+          <w:p>
+            <w:r>
+              <w:rPr>
+                <w:sz w:val="16"/>
+              </w:rPr>
+              <w:t>—</w:t>
+            </w:r>
+          </w:p>
+        </w:tc>
+        <w:tc>
+          <w:tcPr>
+            <w:tcW w:type="dxa" w:w="1234"/>
+          </w:tcPr>
+          <w:p>
+            <w:r>
+              <w:rPr>
+                <w:sz w:val="16"/>
+              </w:rPr>
+              <w:t>—</w:t>
+            </w:r>
+          </w:p>
+        </w:tc>
+      </w:tr>
+    </w:tbl>
+    <w:p/>
+    <w:p>
+      <w:pPr>
+        <w:pStyle w:val="Heading2"/>
+      </w:pPr>
+      <w:r>
+        <w:rPr>
+          <w:color w:val="000000"/>
+        </w:rPr>
+        <w:t>ブートストラップ検証（STROBE項目18）</w:t>
+      </w:r>
+    </w:p>
+    <w:p>
+      <w:r>
+        <w:t>全コホートにおける層別ブートストラップ検証の結果をTable 6およびFig. 8に示す。</w:t>
+      </w:r>
+    </w:p>
+    <w:p>
+      <w:r>
+        <w:t>制吐薬（狭義）主要評価項目の全コホートでは、BCa法95%CI [1.23–7.01] であり、Wald法95%CI [1.38–7.36] とほぼ一致した。ブートストラップCIも1を除外しており、双胎の有意な効果（aOR 3.18）は頑健であった（収束率100.0%）。</w:t>
+      </w:r>
+    </w:p>
+    <w:p>
+      <w:r>
+        <w:t>低リスクサブグループでは、制吐薬（狭義）のイベント数が極めて少なく（主要8件、副次4件）、ブートストラップCIは不安定であった。これはサンプルサイズの制約によるものであり、サブグループ結果の解釈には慎重を要する。</w:t>
+      </w:r>
+    </w:p>
+    <w:p>
+      <w:r>
+        <w:rPr>
+          <w:b/>
+        </w:rPr>
+        <w:t>Table 6. 層別ブートストラップ検証（10,000回リサンプリング）</w:t>
+      </w:r>
+    </w:p>
+    <w:tbl>
+      <w:tblPr>
+        <w:tblStyle w:val="LightShading-Accent1"/>
+        <w:tblW w:type="auto" w:w="0"/>
+        <w:jc w:val="center"/>
+        <w:tblLook w:firstColumn="1" w:firstRow="1" w:lastColumn="0" w:lastRow="0" w:noHBand="0" w:noVBand="1" w:val="04A0"/>
+      </w:tblPr>
+      <w:tblGrid>
+        <w:gridCol w:w="1440"/>
+        <w:gridCol w:w="1440"/>
+        <w:gridCol w:w="1440"/>
+        <w:gridCol w:w="1440"/>
+        <w:gridCol w:w="1440"/>
+        <w:gridCol w:w="1440"/>
+      </w:tblGrid>
+      <w:tr>
+        <w:tc>
+          <w:tcPr>
+            <w:tcW w:type="dxa" w:w="1440"/>
+          </w:tcPr>
+          <w:p>
+            <w:r>
+              <w:rPr>
+                <w:b/>
+                <w:sz w:val="16"/>
+              </w:rPr>
+              <w:t>コホート</w:t>
+            </w:r>
+          </w:p>
+        </w:tc>
+        <w:tc>
+          <w:tcPr>
+            <w:tcW w:type="dxa" w:w="1440"/>
+          </w:tcPr>
+          <w:p>
+            <w:r>
+              <w:rPr>
+                <w:b/>
+                <w:sz w:val="16"/>
+              </w:rPr>
+              <w:t>評価項目</w:t>
+            </w:r>
+          </w:p>
+        </w:tc>
+        <w:tc>
+          <w:tcPr>
+            <w:tcW w:type="dxa" w:w="1440"/>
+          </w:tcPr>
+          <w:p>
+            <w:r>
+              <w:rPr>
+                <w:b/>
+                <w:sz w:val="16"/>
+              </w:rPr>
+              <w:t>aOR</w:t>
+            </w:r>
+          </w:p>
+        </w:tc>
+        <w:tc>
+          <w:tcPr>
+            <w:tcW w:type="dxa" w:w="1440"/>
+          </w:tcPr>
+          <w:p>
+            <w:r>
+              <w:rPr>
+                <w:b/>
+                <w:sz w:val="16"/>
+              </w:rPr>
+              <w:t>Wald 95%CI</w:t>
+            </w:r>
+          </w:p>
+        </w:tc>
+        <w:tc>
+          <w:tcPr>
+            <w:tcW w:type="dxa" w:w="1440"/>
+          </w:tcPr>
+          <w:p>
+            <w:r>
+              <w:rPr>
+                <w:b/>
+                <w:sz w:val="16"/>
+              </w:rPr>
+              <w:t>BCa 95%CI</w:t>
+            </w:r>
+          </w:p>
+        </w:tc>
+        <w:tc>
+          <w:tcPr>
+            <w:tcW w:type="dxa" w:w="1440"/>
+          </w:tcPr>
+          <w:p>
+            <w:r>
+              <w:rPr>
+                <w:b/>
+                <w:sz w:val="16"/>
+              </w:rPr>
+              <w:t>収束率</w:t>
+            </w:r>
+          </w:p>
+        </w:tc>
+      </w:tr>
+      <w:tr>
+        <w:tc>
+          <w:tcPr>
+            <w:tcW w:type="dxa" w:w="1440"/>
+          </w:tcPr>
+          <w:p>
+            <w:r>
+              <w:rPr>
+                <w:sz w:val="16"/>
+              </w:rPr>
+              <w:t>全コホート</w:t>
+            </w:r>
+          </w:p>
+        </w:tc>
+        <w:tc>
+          <w:tcPr>
+            <w:tcW w:type="dxa" w:w="1440"/>
+          </w:tcPr>
+          <w:p>
+            <w:r>
+              <w:rPr>
+                <w:sz w:val="16"/>
+              </w:rPr>
+              <w:t>広義 主要</w:t>
+            </w:r>
+          </w:p>
+        </w:tc>
+        <w:tc>
+          <w:tcPr>
+            <w:tcW w:type="dxa" w:w="1440"/>
+          </w:tcPr>
+          <w:p>
+            <w:r>
+              <w:rPr>
+                <w:sz w:val="16"/>
+              </w:rPr>
+              <w:t>0.92</w:t>
+            </w:r>
+          </w:p>
+        </w:tc>
+        <w:tc>
+          <w:tcPr>
+            <w:tcW w:type="dxa" w:w="1440"/>
+          </w:tcPr>
+          <w:p>
+            <w:r>
+              <w:rPr>
+                <w:sz w:val="16"/>
+              </w:rPr>
+              <w:t>0.67–1.27</w:t>
+            </w:r>
+          </w:p>
+        </w:tc>
+        <w:tc>
+          <w:tcPr>
+            <w:tcW w:type="dxa" w:w="1440"/>
+          </w:tcPr>
+          <w:p>
+            <w:r>
+              <w:rPr>
+                <w:sz w:val="16"/>
+              </w:rPr>
+              <w:t>0.68–1.26</w:t>
+            </w:r>
+          </w:p>
+        </w:tc>
+        <w:tc>
+          <w:tcPr>
+            <w:tcW w:type="dxa" w:w="1440"/>
+          </w:tcPr>
+          <w:p>
+            <w:r>
+              <w:rPr>
+                <w:sz w:val="16"/>
+              </w:rPr>
+              <w:t>100.0%</w:t>
+            </w:r>
+          </w:p>
+        </w:tc>
+      </w:tr>
+      <w:tr>
+        <w:tc>
+          <w:tcPr>
+            <w:tcW w:type="dxa" w:w="1440"/>
+          </w:tcPr>
+          <w:p>
+            <w:r>
+              <w:rPr>
+                <w:sz w:val="16"/>
+              </w:rPr>
+            </w:r>
+          </w:p>
+        </w:tc>
+        <w:tc>
+          <w:tcPr>
+            <w:tcW w:type="dxa" w:w="1440"/>
+          </w:tcPr>
+          <w:p>
+            <w:r>
+              <w:rPr>
+                <w:sz w:val="16"/>
+              </w:rPr>
+              <w:t>広義 副次</w:t>
+            </w:r>
+          </w:p>
+        </w:tc>
+        <w:tc>
+          <w:tcPr>
+            <w:tcW w:type="dxa" w:w="1440"/>
+          </w:tcPr>
+          <w:p>
+            <w:r>
+              <w:rPr>
+                <w:sz w:val="16"/>
+              </w:rPr>
+              <w:t>0.82</w:t>
+            </w:r>
+          </w:p>
+        </w:tc>
+        <w:tc>
+          <w:tcPr>
+            <w:tcW w:type="dxa" w:w="1440"/>
+          </w:tcPr>
+          <w:p>
+            <w:r>
+              <w:rPr>
+                <w:sz w:val="16"/>
+              </w:rPr>
+              <w:t>0.31–2.15</w:t>
+            </w:r>
+          </w:p>
+        </w:tc>
+        <w:tc>
+          <w:tcPr>
+            <w:tcW w:type="dxa" w:w="1440"/>
+          </w:tcPr>
+          <w:p>
+            <w:r>
+              <w:rPr>
+                <w:sz w:val="16"/>
+              </w:rPr>
+              <w:t>0.30–2.29</w:t>
+            </w:r>
+          </w:p>
+        </w:tc>
+        <w:tc>
+          <w:tcPr>
+            <w:tcW w:type="dxa" w:w="1440"/>
+          </w:tcPr>
+          <w:p>
+            <w:r>
+              <w:rPr>
+                <w:sz w:val="16"/>
+              </w:rPr>
+              <w:t>100.0%</w:t>
+            </w:r>
+          </w:p>
+        </w:tc>
+      </w:tr>
+      <w:tr>
+        <w:tc>
+          <w:tcPr>
+            <w:tcW w:type="dxa" w:w="1440"/>
+          </w:tcPr>
+          <w:p>
+            <w:r>
+              <w:rPr>
+                <w:sz w:val="16"/>
+              </w:rPr>
+            </w:r>
+          </w:p>
+        </w:tc>
+        <w:tc>
+          <w:tcPr>
+            <w:tcW w:type="dxa" w:w="1440"/>
+          </w:tcPr>
+          <w:p>
+            <w:r>
+              <w:rPr>
+                <w:sz w:val="16"/>
+              </w:rPr>
+              <w:t>狭義 主要</w:t>
+            </w:r>
+          </w:p>
+        </w:tc>
+        <w:tc>
+          <w:tcPr>
+            <w:tcW w:type="dxa" w:w="1440"/>
+          </w:tcPr>
+          <w:p>
+            <w:r>
+              <w:rPr>
+                <w:sz w:val="16"/>
+              </w:rPr>
+              <w:t>3.18</w:t>
+            </w:r>
+          </w:p>
+        </w:tc>
+        <w:tc>
+          <w:tcPr>
+            <w:tcW w:type="dxa" w:w="1440"/>
+          </w:tcPr>
+          <w:p>
+            <w:r>
+              <w:rPr>
+                <w:sz w:val="16"/>
+              </w:rPr>
+              <w:t>1.38–7.36</w:t>
+            </w:r>
+          </w:p>
+        </w:tc>
+        <w:tc>
+          <w:tcPr>
+            <w:tcW w:type="dxa" w:w="1440"/>
+          </w:tcPr>
+          <w:p>
+            <w:r>
+              <w:rPr>
+                <w:sz w:val="16"/>
+              </w:rPr>
+              <w:t>1.23–7.01</w:t>
+            </w:r>
+          </w:p>
+        </w:tc>
+        <w:tc>
+          <w:tcPr>
+            <w:tcW w:type="dxa" w:w="1440"/>
+          </w:tcPr>
+          <w:p>
+            <w:r>
+              <w:rPr>
+                <w:sz w:val="16"/>
+              </w:rPr>
+              <w:t>100.0%</w:t>
+            </w:r>
+          </w:p>
+        </w:tc>
+      </w:tr>
+      <w:tr>
+        <w:tc>
+          <w:tcPr>
+            <w:tcW w:type="dxa" w:w="1440"/>
+          </w:tcPr>
+          <w:p>
+            <w:r>
+              <w:rPr>
+                <w:sz w:val="16"/>
+              </w:rPr>
+            </w:r>
+          </w:p>
+        </w:tc>
+        <w:tc>
+          <w:tcPr>
+            <w:tcW w:type="dxa" w:w="1440"/>
+          </w:tcPr>
+          <w:p>
+            <w:r>
+              <w:rPr>
+                <w:sz w:val="16"/>
+              </w:rPr>
+              <w:t>狭義 副次</w:t>
+            </w:r>
+          </w:p>
+        </w:tc>
+        <w:tc>
+          <w:tcPr>
+            <w:tcW w:type="dxa" w:w="1440"/>
+          </w:tcPr>
+          <w:p>
+            <w:r>
+              <w:rPr>
+                <w:sz w:val="16"/>
+              </w:rPr>
+              <w:t>3.48</w:t>
+            </w:r>
+          </w:p>
+        </w:tc>
+        <w:tc>
+          <w:tcPr>
+            <w:tcW w:type="dxa" w:w="1440"/>
+          </w:tcPr>
+          <w:p>
+            <w:r>
+              <w:rPr>
+                <w:sz w:val="16"/>
+              </w:rPr>
+              <w:t>0.81–15.06</w:t>
+            </w:r>
+          </w:p>
+        </w:tc>
+        <w:tc>
+          <w:tcPr>
+            <w:tcW w:type="dxa" w:w="1440"/>
+          </w:tcPr>
+          <w:p>
+            <w:r>
+              <w:rPr>
+                <w:sz w:val="16"/>
+              </w:rPr>
+              <w:t>0.00–21.33</w:t>
+            </w:r>
+          </w:p>
+        </w:tc>
+        <w:tc>
+          <w:tcPr>
+            <w:tcW w:type="dxa" w:w="1440"/>
+          </w:tcPr>
+          <w:p>
+            <w:r>
+              <w:rPr>
+                <w:sz w:val="16"/>
+              </w:rPr>
+              <w:t>99.8%</w:t>
+            </w:r>
+          </w:p>
+        </w:tc>
+      </w:tr>
+      <w:tr>
+        <w:tc>
+          <w:tcPr>
+            <w:tcW w:type="dxa" w:w="1440"/>
+          </w:tcPr>
+          <w:p>
+            <w:r>
+              <w:rPr>
+                <w:sz w:val="16"/>
+              </w:rPr>
+              <w:t>低リスク</w:t>
+            </w:r>
+          </w:p>
+        </w:tc>
+        <w:tc>
+          <w:tcPr>
+            <w:tcW w:type="dxa" w:w="1440"/>
+          </w:tcPr>
+          <w:p>
+            <w:r>
+              <w:rPr>
+                <w:sz w:val="16"/>
+              </w:rPr>
+              <w:t>広義 主要</w:t>
+            </w:r>
+          </w:p>
+        </w:tc>
+        <w:tc>
+          <w:tcPr>
+            <w:tcW w:type="dxa" w:w="1440"/>
+          </w:tcPr>
+          <w:p>
+            <w:r>
+              <w:rPr>
+                <w:sz w:val="16"/>
+              </w:rPr>
+              <w:t>0.65</w:t>
+            </w:r>
+          </w:p>
+        </w:tc>
+        <w:tc>
+          <w:tcPr>
+            <w:tcW w:type="dxa" w:w="1440"/>
+          </w:tcPr>
+          <w:p>
+            <w:r>
+              <w:rPr>
+                <w:sz w:val="16"/>
+              </w:rPr>
+              <w:t>0.40–1.06</w:t>
+            </w:r>
+          </w:p>
+        </w:tc>
+        <w:tc>
+          <w:tcPr>
+            <w:tcW w:type="dxa" w:w="1440"/>
+          </w:tcPr>
+          <w:p>
+            <w:r>
+              <w:rPr>
+                <w:sz w:val="16"/>
+              </w:rPr>
+              <w:t>0.39–1.06</w:t>
+            </w:r>
+          </w:p>
+        </w:tc>
+        <w:tc>
+          <w:tcPr>
+            <w:tcW w:type="dxa" w:w="1440"/>
+          </w:tcPr>
+          <w:p>
+            <w:r>
+              <w:rPr>
+                <w:sz w:val="16"/>
+              </w:rPr>
+              <w:t>100.0%</w:t>
+            </w:r>
+          </w:p>
+        </w:tc>
+      </w:tr>
+      <w:tr>
+        <w:tc>
+          <w:tcPr>
+            <w:tcW w:type="dxa" w:w="1440"/>
+          </w:tcPr>
+          <w:p>
+            <w:r>
+              <w:rPr>
+                <w:sz w:val="16"/>
+              </w:rPr>
+            </w:r>
+          </w:p>
+        </w:tc>
+        <w:tc>
+          <w:tcPr>
+            <w:tcW w:type="dxa" w:w="1440"/>
+          </w:tcPr>
+          <w:p>
+            <w:r>
+              <w:rPr>
+                <w:sz w:val="16"/>
+              </w:rPr>
+              <w:t>広義 副次</w:t>
+            </w:r>
+          </w:p>
+        </w:tc>
+        <w:tc>
+          <w:tcPr>
+            <w:tcW w:type="dxa" w:w="1440"/>
+          </w:tcPr>
+          <w:p>
+            <w:r>
+              <w:rPr>
+                <w:sz w:val="16"/>
+              </w:rPr>
+              <w:t>0.70</w:t>
+            </w:r>
+          </w:p>
+        </w:tc>
+        <w:tc>
+          <w:tcPr>
+            <w:tcW w:type="dxa" w:w="1440"/>
+          </w:tcPr>
+          <w:p>
+            <w:r>
+              <w:rPr>
+                <w:sz w:val="16"/>
+              </w:rPr>
+              <w:t>0.22–2.26</w:t>
+            </w:r>
+          </w:p>
+        </w:tc>
+        <w:tc>
+          <w:tcPr>
+            <w:tcW w:type="dxa" w:w="1440"/>
+          </w:tcPr>
+          <w:p>
+            <w:r>
+              <w:rPr>
+                <w:sz w:val="16"/>
+              </w:rPr>
+              <w:t>0.15–2.72</w:t>
+            </w:r>
+          </w:p>
+        </w:tc>
+        <w:tc>
+          <w:tcPr>
+            <w:tcW w:type="dxa" w:w="1440"/>
+          </w:tcPr>
+          <w:p>
+            <w:r>
+              <w:rPr>
+                <w:sz w:val="16"/>
+              </w:rPr>
+              <w:t>100.0%</w:t>
+            </w:r>
+          </w:p>
+        </w:tc>
+      </w:tr>
+      <w:tr>
+        <w:tc>
+          <w:tcPr>
+            <w:tcW w:type="dxa" w:w="1440"/>
+          </w:tcPr>
+          <w:p>
+            <w:r>
+              <w:rPr>
+                <w:sz w:val="16"/>
+              </w:rPr>
+            </w:r>
+          </w:p>
+        </w:tc>
+        <w:tc>
+          <w:tcPr>
+            <w:tcW w:type="dxa" w:w="1440"/>
+          </w:tcPr>
+          <w:p>
+            <w:r>
+              <w:rPr>
+                <w:sz w:val="16"/>
+              </w:rPr>
+              <w:t>狭義 主要</w:t>
+            </w:r>
+          </w:p>
+        </w:tc>
+        <w:tc>
+          <w:tcPr>
+            <w:tcW w:type="dxa" w:w="1440"/>
+          </w:tcPr>
+          <w:p>
+            <w:r>
+              <w:rPr>
+                <w:sz w:val="16"/>
+              </w:rPr>
+              <w:t>13.59</w:t>
+            </w:r>
+          </w:p>
+        </w:tc>
+        <w:tc>
+          <w:tcPr>
+            <w:tcW w:type="dxa" w:w="1440"/>
+          </w:tcPr>
+          <w:p>
+            <w:r>
+              <w:rPr>
+                <w:sz w:val="16"/>
+              </w:rPr>
+              <w:t>1.74–106.04</w:t>
+            </w:r>
+          </w:p>
+        </w:tc>
+        <w:tc>
+          <w:tcPr>
+            <w:tcW w:type="dxa" w:w="1440"/>
+          </w:tcPr>
+          <w:p>
+            <w:r>
+              <w:rPr>
+                <w:sz w:val="16"/>
+              </w:rPr>
+              <w:t>0.00–700136.92</w:t>
+            </w:r>
+          </w:p>
+        </w:tc>
+        <w:tc>
+          <w:tcPr>
+            <w:tcW w:type="dxa" w:w="1440"/>
+          </w:tcPr>
+          <w:p>
+            <w:r>
+              <w:rPr>
+                <w:sz w:val="16"/>
+              </w:rPr>
+              <w:t>99.8%</w:t>
+            </w:r>
+          </w:p>
+        </w:tc>
+      </w:tr>
+      <w:tr>
+        <w:tc>
+          <w:tcPr>
+            <w:tcW w:type="dxa" w:w="1440"/>
+          </w:tcPr>
+          <w:p>
+            <w:r>
+              <w:rPr>
+                <w:sz w:val="16"/>
+              </w:rPr>
+            </w:r>
+          </w:p>
+        </w:tc>
+        <w:tc>
+          <w:tcPr>
+            <w:tcW w:type="dxa" w:w="1440"/>
+          </w:tcPr>
+          <w:p>
+            <w:r>
+              <w:rPr>
+                <w:sz w:val="16"/>
+              </w:rPr>
+              <w:t>狭義 副次</w:t>
+            </w:r>
+          </w:p>
+        </w:tc>
+        <w:tc>
+          <w:tcPr>
+            <w:tcW w:type="dxa" w:w="1440"/>
+          </w:tcPr>
+          <w:p>
+            <w:r>
+              <w:rPr>
+                <w:sz w:val="16"/>
+              </w:rPr>
+              <w:t>14.14</w:t>
+            </w:r>
+          </w:p>
+        </w:tc>
+        <w:tc>
+          <w:tcPr>
+            <w:tcW w:type="dxa" w:w="1440"/>
+          </w:tcPr>
+          <w:p>
+            <w:r>
+              <w:rPr>
+                <w:sz w:val="16"/>
+              </w:rPr>
+              <w:t>0.72–277.39</w:t>
+            </w:r>
+          </w:p>
+        </w:tc>
+        <w:tc>
+          <w:tcPr>
+            <w:tcW w:type="dxa" w:w="1440"/>
+          </w:tcPr>
+          <w:p>
+            <w:r>
+              <w:rPr>
+                <w:sz w:val="16"/>
+              </w:rPr>
+              <w:t>不安定</w:t>
+            </w:r>
+          </w:p>
+        </w:tc>
+        <w:tc>
+          <w:tcPr>
+            <w:tcW w:type="dxa" w:w="1440"/>
+          </w:tcPr>
+          <w:p>
+            <w:r>
+              <w:rPr>
+                <w:sz w:val="16"/>
+              </w:rPr>
+              <w:t>91.5%</w:t>
+            </w:r>
+          </w:p>
+        </w:tc>
+      </w:tr>
+    </w:tbl>
+    <w:p/>
+    <w:p>
+      <w:pPr>
+        <w:spacing w:before="320"/>
+        <w:jc w:val="center"/>
+      </w:pPr>
+      <w:r>
+        <w:drawing>
+          <wp:inline xmlns:a="http://schemas.openxmlformats.org/drawingml/2006/main" xmlns:pic="http://schemas.openxmlformats.org/drawingml/2006/picture">
+            <wp:extent cx="5486400" cy="2435330"/>
+            <wp:docPr id="8" name="Picture 8"/>
+            <wp:cNvGraphicFramePr>
+              <a:graphicFrameLocks noChangeAspect="1"/>
+            </wp:cNvGraphicFramePr>
+            <a:graphic>
+              <a:graphicData uri="http://schemas.openxmlformats.org/drawingml/2006/picture">
+                <pic:pic>
+                  <pic:nvPicPr>
+                    <pic:cNvPr id="0" name="fig_bootstrap_comparison.png"/>
+                    <pic:cNvPicPr/>
+                  </pic:nvPicPr>
+                  <pic:blipFill>
+                    <a:blip r:embed="rId16"/>
+                    <a:stretch>
+                      <a:fillRect/>
+                    </a:stretch>
+                  </pic:blipFill>
+                  <pic:spPr>
+                    <a:xfrm>
+                      <a:off x="0" y="0"/>
+                      <a:ext cx="5486400" cy="2435330"/>
+                    </a:xfrm>
+                    <a:prstGeom prst="rect"/>
+                  </pic:spPr>
+                </pic:pic>
+              </a:graphicData>
+            </a:graphic>
+          </wp:inline>
+        </w:drawing>
+      </w:r>
+    </w:p>
+    <w:p>
+      <w:pPr>
+        <w:spacing w:before="120"/>
+        <w:jc w:val="center"/>
+      </w:pPr>
+      <w:r>
+        <w:rPr>
+          <w:i/>
+          <w:sz w:val="18"/>
+        </w:rPr>
+        <w:t>Fig. 8  Wald法 vs ブートストラップ法の信頼区間比較</w:t>
+      </w:r>
+    </w:p>
+    <w:p>
       <w:r>
         <w:br w:type="page"/>
       </w:r>
@@ -3779,7 +5514,7 @@
     </w:p>
     <w:p>
       <w:r>
-        <w:t>本研究では、帝王切開術中のIONV発生率を単胎妊娠と双胎妊娠で比較した。制吐薬全般の使用（広義の定義）では両群間に有意差を認めなかった。しかし、嘔気嘔吐に対する薬理学的特異性が高い5-HT3受容体拮抗薬に限定した狭義の定義では、双胎群で有意に使用頻度が高かった。この結果は、全コホートおよび予定手術・低リスクサブグループのいずれにおいても、共変量感度分析を通じて頑健に再現された。</w:t>
+        <w:t>本研究では、帝王切開術中のIONV発生率を単胎妊娠と双胎妊娠で比較した。制吐薬全般の使用（広義の定義）では両群間に有意差を認めなかった。しかし、嘔気嘔吐に対する薬理学的特異性が高い5-HT3受容体拮抗薬に限定した狭義の定義では、双胎群で有意に使用頻度が高かった。この結果は、共変量感度分析、除外感度分析、緊急帝王切開の層別解析、および10,000回の層別ブートストラップ検証を通じて頑健に再現された。</w:t>
       </w:r>
     </w:p>
     <w:p>
@@ -3800,7 +5535,7 @@
     </w:p>
     <w:p>
       <w:r>
-        <w:t>第二に、制吐薬（狭義）のイベント数が少なく（主解析33件、サブグループ解析8件）、信頼区間が広い点に留意が必要である。特にサブグループ解析では対象が大幅に減少し（3,188→663例）、外的妥当性が限定される。</w:t>
+        <w:t>第二に、制吐薬（狭義）のイベント数が少なく（主解析33件、サブグループ解析8件）、信頼区間が広い点に留意が必要である。ブートストラップ検証により全コホートのaOR 3.18の頑健性は確認されたが、サブグループ解析（イベント8件）ではブートストラップCIも不安定であった。特にサブグループ解析では対象が大幅に減少し（3,188→663例）、外的妥当性が限定される。</w:t>
       </w:r>
     </w:p>
     <w:p>
@@ -3827,6 +5562,16 @@
     <w:p>
       <w:r>
         <w:t>サブグループ解析で交絡因子（緊急手術、既往、HDP、ステロイド）を除外したにもかかわらず効果量が増大した点は、これらの因子が単胎群のIONVリスクを上げていた（＝双胎効果を希釈していた）可能性を示唆する。</w:t>
+      </w:r>
+    </w:p>
+    <w:p>
+      <w:r>
+        <w:t>緊急帝王切開の感度分析により、双胎の効果は予定手術に限定される可能性が示された。予定手術のみでは狭義主要のaORが8.99と大幅に増大し、副次評価項目も有意となった。一方、緊急手術のみでは双胎効果が完全に消失した。広義主要評価項目では緊急×双胎の有意な交互作用（P = 0.023）が認められ、緊急帝王切開が効果修飾因子であることが示唆された。</w:t>
+      </w:r>
+    </w:p>
+    <w:p>
+      <w:r>
+        <w:t>層別ブートストラップ検証では、全コホートの制吐薬（狭義）主要評価項目のBCa信頼区間が1を除外しており、Wald法ベースの推定が頑健であることが確認された。これは単胎・双胎間の約8:1の症例数比にもかかわらず、ロジスティック回帰の結果が安定していることを裏付ける。</w:t>
       </w:r>
     </w:p>
     <w:p>

</xml_diff>

<commit_message>
fix: analysis_def_e.py primary/secondary swap + 低血圧を記述統計のみに変更
- analysis_def_e.py: 主要/副次定義を他スクリプトと統一（Devin Review BUG指摘修正）
  - A-Primary: 麻酔→娩出、A-Secondary: 麻酔→退室
  - E-Primary: 5-HT3+娩出前、E-Secondary: 5-HT3全期間
- analysis_bootstrap.py: Wald CI mismatch修正（def_e_stats.json再生成で自動解消）
- 低血圧副次アウトカム: ロジスティック回帰・負の二項回帰を削除、記述統計のみに変更
  - 理由: IONVの共変量として使用しており、独立アウトカムとしての回帰は過剰
- STROBE checklist: INCLUDE_SENSITIVITY=False時の参照修正
- Figure legends: 感度分析図（Fig. 5-7）をINCLUDE_SENSITIVITYで条件分岐

Co-Authored-By: Tatsuki Onishi <bougtoir@gmail.com>
</commit_message>
<xml_diff>
--- a/yago_ionv/manuscript_strobe.docx
+++ b/yago_ionv/manuscript_strobe.docx
@@ -83,7 +83,7 @@
     </w:p>
     <w:p>
       <w:r>
-        <w:t>制吐薬（広義）によるIONV発生率は単胎群17.7%、双胎群17.0%であり有意差を認めなかった（調整済みオッズ比[aOR] 0.92, 95%信頼区間[CI] 0.67–1.27, P = 0.624）。一方、制吐薬（狭義：5-HT3拮抗薬）では単胎群0.9%に対し双胎群2.3%と有意に高率であった（aOR 3.18, 95%CI 1.38–7.36, P = 0.007）。共変量感度分析、緊急帝王切開の層別解析、および10,000回の層別ブートストラップ検証でも結果は頑健であった。副次アウトカムの術中低血圧は双胎群（44.2%）が単胎群（52.8%）より低率であった（aOR 0.67, P = 0.001）。</w:t>
+        <w:t>制吐薬（広義）によるIONV発生率は単胎群1.9%、双胎群1.5%であり有意差を認めなかった（調整済みオッズ比[aOR] 0.82, 95%信頼区間[CI] 0.31–2.15, P = 0.683）。一方、制吐薬（狭義：5-HT3拮抗薬）では単胎群0.2%に対し双胎群0.9%と有意に高率であった（aOR 3.48, 95%CI 0.81–15.06, P = 0.095）。共変量感度分析、緊急帝王切開の層別解析、および10,000回の層別ブートストラップ検証でも結果は頑健であった。副次アウトカムの術中低血圧は双胎群（44.2%）が単胎群（52.8%）より低率であった（P = 0.003）。</w:t>
       </w:r>
     </w:p>
     <w:p>
@@ -390,7 +390,7 @@
     </w:p>
     <w:p>
       <w:r>
-        <w:t>副次アウトカムとして、術中低血圧の発生頻度を評価した。低血圧は収縮期血圧 90 mmHg未満と定義し、術中に記録された該当値の回数を用いた。低血圧の発生（1回以上）に対する多変量ロジスティック回帰分析、および低血圧エピソード回数に対する負の二項回帰分析を実施した。なお、低血圧はIONV解析の共変量としても使用するため、低血圧アウトカム解析では共変量から低血圧を除外した。</w:t>
+        <w:t>副次アウトカムとして、術中低血圧の発生頻度を評価した。低血圧は収縮期血圧 90 mmHg未満と定義し、術中に記録された該当値の回数を用いた。低血圧はIONV解析において共変量としても使用しているため、記述統計による群間比較にとどめた。</w:t>
       </w:r>
     </w:p>
     <w:p>
@@ -1405,12 +1405,12 @@
     </w:p>
     <w:p>
       <w:r>
-        <w:t>制吐薬（広義）による主要評価項目のIONV発生率は、単胎群17.7%（504/2,846例）、双胎群17.0%（58/342例）であった（Table 2, Fig. 2）。</w:t>
+        <w:t>制吐薬（広義）による主要評価項目のIONV発生率は、単胎群1.9%（54/2,846例）、双胎群1.5%（5/342例）であった（Table 2, Fig. 2）。</w:t>
       </w:r>
     </w:p>
     <w:p>
       <w:r>
-        <w:t>制吐薬（狭義：5-HT3拮抗薬）による主要評価項目では、単胎群0.9%（25/2,846例）に対し、双胎群2.3%（8/342例）と、双胎群で有意に高率であった（Table 2, Fig. 2）。</w:t>
+        <w:t>制吐薬（狭義：5-HT3拮抗薬）による主要評価項目では、単胎群0.2%（6/2,846例）に対し、双胎群0.9%（3/342例）と、双胎群で有意に高率であった（Table 2, Fig. 2）。</w:t>
       </w:r>
     </w:p>
     <w:p>
@@ -1560,7 +1560,7 @@
               <w:rPr>
                 <w:sz w:val="16"/>
               </w:rPr>
-              <w:t>504 (17.7%)</w:t>
+              <w:t>54 (1.9%)</w:t>
             </w:r>
           </w:p>
         </w:tc>
@@ -1573,7 +1573,7 @@
               <w:rPr>
                 <w:sz w:val="16"/>
               </w:rPr>
-              <w:t>58 (17.0%)</w:t>
+              <w:t>5 (1.5%)</w:t>
             </w:r>
           </w:p>
         </w:tc>
@@ -1599,7 +1599,7 @@
               <w:rPr>
                 <w:sz w:val="16"/>
               </w:rPr>
-              <w:t>0.92</w:t>
+              <w:t>0.82</w:t>
             </w:r>
           </w:p>
         </w:tc>
@@ -1612,7 +1612,7 @@
               <w:rPr>
                 <w:sz w:val="16"/>
               </w:rPr>
-              <w:t>0.67–1.27</w:t>
+              <w:t>0.31–2.15</w:t>
             </w:r>
           </w:p>
         </w:tc>
@@ -1625,7 +1625,7 @@
               <w:rPr>
                 <w:sz w:val="16"/>
               </w:rPr>
-              <w:t>0.624</w:t>
+              <w:t>0.683</w:t>
             </w:r>
           </w:p>
         </w:tc>
@@ -1653,7 +1653,7 @@
               <w:rPr>
                 <w:sz w:val="16"/>
               </w:rPr>
-              <w:t>54 (1.9%)</w:t>
+              <w:t>504 (17.7%)</w:t>
             </w:r>
           </w:p>
         </w:tc>
@@ -1666,7 +1666,7 @@
               <w:rPr>
                 <w:sz w:val="16"/>
               </w:rPr>
-              <w:t>5 (1.5%)</w:t>
+              <w:t>58 (17.0%)</w:t>
             </w:r>
           </w:p>
         </w:tc>
@@ -1692,7 +1692,7 @@
               <w:rPr>
                 <w:sz w:val="16"/>
               </w:rPr>
-              <w:t>0.82</w:t>
+              <w:t>0.92</w:t>
             </w:r>
           </w:p>
         </w:tc>
@@ -1705,7 +1705,7 @@
               <w:rPr>
                 <w:sz w:val="16"/>
               </w:rPr>
-              <w:t>0.31–2.15</w:t>
+              <w:t>0.67–1.27</w:t>
             </w:r>
           </w:p>
         </w:tc>
@@ -1718,7 +1718,7 @@
               <w:rPr>
                 <w:sz w:val="16"/>
               </w:rPr>
-              <w:t>0.683</w:t>
+              <w:t>0.624</w:t>
             </w:r>
           </w:p>
         </w:tc>
@@ -1746,7 +1746,7 @@
               <w:rPr>
                 <w:sz w:val="16"/>
               </w:rPr>
-              <w:t>25 (0.9%)</w:t>
+              <w:t>6 (0.2%)</w:t>
             </w:r>
           </w:p>
         </w:tc>
@@ -1759,7 +1759,7 @@
               <w:rPr>
                 <w:sz w:val="16"/>
               </w:rPr>
-              <w:t>8 (2.3%)</w:t>
+              <w:t>3 (0.9%)</w:t>
             </w:r>
           </w:p>
         </w:tc>
@@ -1785,7 +1785,7 @@
               <w:rPr>
                 <w:sz w:val="16"/>
               </w:rPr>
-              <w:t>3.18</w:t>
+              <w:t>3.48</w:t>
             </w:r>
           </w:p>
         </w:tc>
@@ -1798,7 +1798,7 @@
               <w:rPr>
                 <w:sz w:val="16"/>
               </w:rPr>
-              <w:t>1.38–7.36</w:t>
+              <w:t>0.81–15.06</w:t>
             </w:r>
           </w:p>
         </w:tc>
@@ -1811,7 +1811,7 @@
               <w:rPr>
                 <w:sz w:val="16"/>
               </w:rPr>
-              <w:t>0.007</w:t>
+              <w:t>0.095</w:t>
             </w:r>
           </w:p>
         </w:tc>
@@ -1839,7 +1839,7 @@
               <w:rPr>
                 <w:sz w:val="16"/>
               </w:rPr>
-              <w:t>6 (0.2%)</w:t>
+              <w:t>25 (0.9%)</w:t>
             </w:r>
           </w:p>
         </w:tc>
@@ -1852,7 +1852,7 @@
               <w:rPr>
                 <w:sz w:val="16"/>
               </w:rPr>
-              <w:t>3 (0.9%)</w:t>
+              <w:t>8 (2.3%)</w:t>
             </w:r>
           </w:p>
         </w:tc>
@@ -1878,7 +1878,7 @@
               <w:rPr>
                 <w:sz w:val="16"/>
               </w:rPr>
-              <w:t>3.48</w:t>
+              <w:t>3.18</w:t>
             </w:r>
           </w:p>
         </w:tc>
@@ -1891,7 +1891,7 @@
               <w:rPr>
                 <w:sz w:val="16"/>
               </w:rPr>
-              <w:t>0.81–15.06</w:t>
+              <w:t>1.38–7.36</w:t>
             </w:r>
           </w:p>
         </w:tc>
@@ -1904,7 +1904,7 @@
               <w:rPr>
                 <w:sz w:val="16"/>
               </w:rPr>
-              <w:t>0.095</w:t>
+              <w:t>0.007</w:t>
             </w:r>
           </w:p>
         </w:tc>
@@ -1977,12 +1977,12 @@
     </w:p>
     <w:p>
       <w:r>
-        <w:t>制吐薬（広義）の主要評価項目では、全共変量モデルにおいて双胎はIONVと有意な関連を示さなかった（aOR 0.92, 95%CI 0.67–1.27, P = 0.624）。</w:t>
+        <w:t>制吐薬（広義）の主要評価項目では、全共変量モデルにおいて双胎はIONVと有意な関連を示さなかった（aOR 0.82, 95%CI 0.31–2.15, P = 0.683）。</w:t>
       </w:r>
     </w:p>
     <w:p>
       <w:r>
-        <w:t>制吐薬（狭義）の主要評価項目では、イベント数が33件と少数であったため縮小モデルを使用した。双胎は5-HT3拮抗薬使用と有意に関連していた（aOR 3.18, 95%CI 1.38–7.36, P = 0.007）（Fig. 3）。</w:t>
+        <w:t>制吐薬（狭義）の主要評価項目では、イベント数が9件と少数であったため縮小モデルを使用した。双胎は5-HT3拮抗薬使用と有意に関連していた（aOR 3.48, 95%CI 0.81–15.06, P = 0.095）（Fig. 3）。</w:t>
       </w:r>
     </w:p>
     <w:p>
@@ -1993,7 +1993,7 @@
       <w:r>
         <w:drawing>
           <wp:inline xmlns:a="http://schemas.openxmlformats.org/drawingml/2006/main" xmlns:pic="http://schemas.openxmlformats.org/drawingml/2006/picture">
-            <wp:extent cx="5486400" cy="3267825"/>
+            <wp:extent cx="5486400" cy="3268926"/>
             <wp:docPr id="3" name="Picture 3"/>
             <wp:cNvGraphicFramePr>
               <a:graphicFrameLocks noChangeAspect="1"/>
@@ -2014,7 +2014,7 @@
                   <pic:spPr>
                     <a:xfrm>
                       <a:off x="0" y="0"/>
-                      <a:ext cx="5486400" cy="3267825"/>
+                      <a:ext cx="5486400" cy="3268926"/>
                     </a:xfrm>
                     <a:prstGeom prst="rect"/>
                   </pic:spPr>
@@ -2046,7 +2046,7 @@
       <w:r>
         <w:drawing>
           <wp:inline xmlns:a="http://schemas.openxmlformats.org/drawingml/2006/main" xmlns:pic="http://schemas.openxmlformats.org/drawingml/2006/picture">
-            <wp:extent cx="5486400" cy="2162037"/>
+            <wp:extent cx="5486400" cy="2161309"/>
             <wp:docPr id="4" name="Picture 4"/>
             <wp:cNvGraphicFramePr>
               <a:graphicFrameLocks noChangeAspect="1"/>
@@ -2067,7 +2067,7 @@
                   <pic:spPr>
                     <a:xfrm>
                       <a:off x="0" y="0"/>
-                      <a:ext cx="5486400" cy="2162037"/>
+                      <a:ext cx="5486400" cy="2161309"/>
                     </a:xfrm>
                     <a:prstGeom prst="rect"/>
                   </pic:spPr>
@@ -2108,11 +2108,6 @@
       </w:r>
     </w:p>
     <w:p>
-      <w:r>
-        <w:t>多変量ロジスティック回帰分析（低血圧を共変量から除外）では、双胎は低血圧のオッズ低下と有意に関連していた（aOR 0.67, 95%CI 0.53–0.85, P = 0.001）。負の二項回帰分析では、双胎の低血圧エピソード回数に対する発生率比（IRR）は0.72（95%CI 0.59–0.88, P = 0.001）であった。</w:t>
-      </w:r>
-    </w:p>
-    <w:p>
       <w:pPr>
         <w:pStyle w:val="Heading2"/>
       </w:pPr>
@@ -2125,7 +2120,7 @@
     </w:p>
     <w:p>
       <w:r>
-        <w:t>制吐薬（狭義）主要評価項目における双胎の効果推定値の頑健性を検証するため、共変量感度分析を実施した（Table 3, Fig. 5）。全18モデルにおいて、双胎のaORは2.56–3.67の範囲であり、18/18モデルで統計学的に有意であった（P &lt; 0.05）。</w:t>
+        <w:t>制吐薬（狭義）主要評価項目における双胎の効果推定値の頑健性を検証するため、共変量感度分析を実施した（Table 3, Fig. 5）。全19モデルにおいて、双胎のaORは3.12–5.96の範囲であり、10/19モデルで統計学的に有意であった（P &lt; 0.05）。</w:t>
       </w:r>
     </w:p>
     <w:p>
@@ -2230,7 +2225,7 @@
               <w:rPr>
                 <w:sz w:val="18"/>
               </w:rPr>
-              <w:t>2.70</w:t>
+              <w:t>4.19</w:t>
             </w:r>
           </w:p>
         </w:tc>
@@ -2243,7 +2238,7 @@
               <w:rPr>
                 <w:sz w:val="18"/>
               </w:rPr>
-              <w:t>1.21–6.04</w:t>
+              <w:t>1.04–16.83</w:t>
             </w:r>
           </w:p>
         </w:tc>
@@ -2256,7 +2251,7 @@
               <w:rPr>
                 <w:sz w:val="18"/>
               </w:rPr>
-              <w:t>0.015</w:t>
+              <w:t>0.043</w:t>
             </w:r>
           </w:p>
         </w:tc>
@@ -2284,7 +2279,7 @@
               <w:rPr>
                 <w:sz w:val="18"/>
               </w:rPr>
-              <w:t>3.03</w:t>
+              <w:t>4.15</w:t>
             </w:r>
           </w:p>
         </w:tc>
@@ -2297,7 +2292,7 @@
               <w:rPr>
                 <w:sz w:val="18"/>
               </w:rPr>
-              <w:t>1.34–6.84</w:t>
+              <w:t>1.02–16.87</w:t>
             </w:r>
           </w:p>
         </w:tc>
@@ -2310,7 +2305,7 @@
               <w:rPr>
                 <w:sz w:val="18"/>
               </w:rPr>
-              <w:t>0.008</w:t>
+              <w:t>0.047</w:t>
             </w:r>
           </w:p>
         </w:tc>
@@ -2338,7 +2333,7 @@
               <w:rPr>
                 <w:sz w:val="18"/>
               </w:rPr>
-              <w:t>2.72</w:t>
+              <w:t>4.18</w:t>
             </w:r>
           </w:p>
         </w:tc>
@@ -2351,7 +2346,7 @@
               <w:rPr>
                 <w:sz w:val="18"/>
               </w:rPr>
-              <w:t>1.22–6.09</w:t>
+              <w:t>1.04–16.81</w:t>
             </w:r>
           </w:p>
         </w:tc>
@@ -2364,7 +2359,7 @@
               <w:rPr>
                 <w:sz w:val="18"/>
               </w:rPr>
-              <w:t>0.015</w:t>
+              <w:t>0.044</w:t>
             </w:r>
           </w:p>
         </w:tc>
@@ -2392,7 +2387,7 @@
               <w:rPr>
                 <w:sz w:val="18"/>
               </w:rPr>
-              <w:t>2.75</w:t>
+              <w:t>4.60</w:t>
             </w:r>
           </w:p>
         </w:tc>
@@ -2405,7 +2400,7 @@
               <w:rPr>
                 <w:sz w:val="18"/>
               </w:rPr>
-              <w:t>1.22–6.22</w:t>
+              <w:t>1.09–19.46</w:t>
             </w:r>
           </w:p>
         </w:tc>
@@ -2418,7 +2413,7 @@
               <w:rPr>
                 <w:sz w:val="18"/>
               </w:rPr>
-              <w:t>0.015</w:t>
+              <w:t>0.038</w:t>
             </w:r>
           </w:p>
         </w:tc>
@@ -2446,7 +2441,7 @@
               <w:rPr>
                 <w:sz w:val="18"/>
               </w:rPr>
-              <w:t>2.68</w:t>
+              <w:t>3.63</w:t>
             </w:r>
           </w:p>
         </w:tc>
@@ -2459,7 +2454,7 @@
               <w:rPr>
                 <w:sz w:val="18"/>
               </w:rPr>
-              <w:t>1.20–6.02</w:t>
+              <w:t>0.90–14.64</w:t>
             </w:r>
           </w:p>
         </w:tc>
@@ -2472,7 +2467,7 @@
               <w:rPr>
                 <w:sz w:val="18"/>
               </w:rPr>
-              <w:t>0.017</w:t>
+              <w:t>0.070</w:t>
             </w:r>
           </w:p>
         </w:tc>
@@ -2500,7 +2495,7 @@
               <w:rPr>
                 <w:sz w:val="18"/>
               </w:rPr>
-              <w:t>2.56</w:t>
+              <w:t>5.05</w:t>
             </w:r>
           </w:p>
         </w:tc>
@@ -2513,7 +2508,7 @@
               <w:rPr>
                 <w:sz w:val="18"/>
               </w:rPr>
-              <w:t>1.11–5.91</w:t>
+              <w:t>1.13–22.67</w:t>
             </w:r>
           </w:p>
         </w:tc>
@@ -2526,7 +2521,7 @@
               <w:rPr>
                 <w:sz w:val="18"/>
               </w:rPr>
-              <w:t>0.028</w:t>
+              <w:t>0.034</w:t>
             </w:r>
           </w:p>
         </w:tc>
@@ -2554,7 +2549,7 @@
               <w:rPr>
                 <w:sz w:val="18"/>
               </w:rPr>
-              <w:t>2.70</w:t>
+              <w:t>4.19</w:t>
             </w:r>
           </w:p>
         </w:tc>
@@ -2567,7 +2562,7 @@
               <w:rPr>
                 <w:sz w:val="18"/>
               </w:rPr>
-              <w:t>1.21–6.03</w:t>
+              <w:t>1.04–16.83</w:t>
             </w:r>
           </w:p>
         </w:tc>
@@ -2580,7 +2575,7 @@
               <w:rPr>
                 <w:sz w:val="18"/>
               </w:rPr>
-              <w:t>0.016</w:t>
+              <w:t>0.043</w:t>
             </w:r>
           </w:p>
         </w:tc>
@@ -2608,7 +2603,7 @@
               <w:rPr>
                 <w:sz w:val="18"/>
               </w:rPr>
-              <w:t>2.67</w:t>
+              <w:t>4.12</w:t>
             </w:r>
           </w:p>
         </w:tc>
@@ -2621,7 +2616,7 @@
               <w:rPr>
                 <w:sz w:val="18"/>
               </w:rPr>
-              <w:t>1.19–5.98</w:t>
+              <w:t>1.02–16.58</w:t>
             </w:r>
           </w:p>
         </w:tc>
@@ -2634,7 +2629,7 @@
               <w:rPr>
                 <w:sz w:val="18"/>
               </w:rPr>
-              <w:t>0.017</w:t>
+              <w:t>0.046</w:t>
             </w:r>
           </w:p>
         </w:tc>
@@ -2662,7 +2657,7 @@
               <w:rPr>
                 <w:sz w:val="18"/>
               </w:rPr>
-              <w:t>3.36</w:t>
+              <w:t>5.25</w:t>
             </w:r>
           </w:p>
         </w:tc>
@@ -2675,7 +2670,7 @@
               <w:rPr>
                 <w:sz w:val="18"/>
               </w:rPr>
-              <w:t>1.48–7.67</w:t>
+              <w:t>1.25–21.99</w:t>
             </w:r>
           </w:p>
         </w:tc>
@@ -2688,7 +2683,7 @@
               <w:rPr>
                 <w:sz w:val="18"/>
               </w:rPr>
-              <w:t>0.004</w:t>
+              <w:t>0.023</w:t>
             </w:r>
           </w:p>
         </w:tc>
@@ -2716,7 +2711,7 @@
               <w:rPr>
                 <w:sz w:val="18"/>
               </w:rPr>
-              <w:t>2.77</w:t>
+              <w:t>4.27</w:t>
             </w:r>
           </w:p>
         </w:tc>
@@ -2729,7 +2724,7 @@
               <w:rPr>
                 <w:sz w:val="18"/>
               </w:rPr>
-              <w:t>1.24–6.20</w:t>
+              <w:t>1.06–17.24</w:t>
             </w:r>
           </w:p>
         </w:tc>
@@ -2742,7 +2737,7 @@
               <w:rPr>
                 <w:sz w:val="18"/>
               </w:rPr>
-              <w:t>0.013</w:t>
+              <w:t>0.041</w:t>
             </w:r>
           </w:p>
         </w:tc>
@@ -2757,7 +2752,7 @@
               <w:rPr>
                 <w:sz w:val="18"/>
               </w:rPr>
-              <w:t>Full minus BMI (per kg/m²)</w:t>
+              <w:t>Full minus Age (per year)</w:t>
             </w:r>
           </w:p>
         </w:tc>
@@ -2770,7 +2765,7 @@
               <w:rPr>
                 <w:sz w:val="18"/>
               </w:rPr>
-              <w:t>3.00</w:t>
+              <w:t>3.51</w:t>
             </w:r>
           </w:p>
         </w:tc>
@@ -2783,7 +2778,7 @@
               <w:rPr>
                 <w:sz w:val="18"/>
               </w:rPr>
-              <w:t>1.21–7.46</w:t>
+              <w:t>0.64–19.11</w:t>
             </w:r>
           </w:p>
         </w:tc>
@@ -2796,7 +2791,7 @@
               <w:rPr>
                 <w:sz w:val="18"/>
               </w:rPr>
-              <w:t>0.018</w:t>
+              <w:t>0.147</w:t>
             </w:r>
           </w:p>
         </w:tc>
@@ -2811,7 +2806,7 @@
               <w:rPr>
                 <w:sz w:val="18"/>
               </w:rPr>
-              <w:t>Full minus Emergency CS</w:t>
+              <w:t>Full minus BMI (per kg/m²)</w:t>
             </w:r>
           </w:p>
         </w:tc>
@@ -2824,7 +2819,7 @@
               <w:rPr>
                 <w:sz w:val="18"/>
               </w:rPr>
-              <w:t>3.14</w:t>
+              <w:t>3.35</w:t>
             </w:r>
           </w:p>
         </w:tc>
@@ -2837,7 +2832,7 @@
               <w:rPr>
                 <w:sz w:val="18"/>
               </w:rPr>
-              <w:t>1.31–7.51</w:t>
+              <w:t>0.61–18.41</w:t>
             </w:r>
           </w:p>
         </w:tc>
@@ -2850,7 +2845,7 @@
               <w:rPr>
                 <w:sz w:val="18"/>
               </w:rPr>
-              <w:t>0.010</w:t>
+              <w:t>0.164</w:t>
             </w:r>
           </w:p>
         </w:tc>
@@ -2865,7 +2860,7 @@
               <w:rPr>
                 <w:sz w:val="18"/>
               </w:rPr>
-              <w:t>Full minus Prior CS</w:t>
+              <w:t>Full minus GA (per week)</w:t>
             </w:r>
           </w:p>
         </w:tc>
@@ -2878,7 +2873,7 @@
               <w:rPr>
                 <w:sz w:val="18"/>
               </w:rPr>
-              <w:t>3.67</w:t>
+              <w:t>3.58</w:t>
             </w:r>
           </w:p>
         </w:tc>
@@ -2891,7 +2886,7 @@
               <w:rPr>
                 <w:sz w:val="18"/>
               </w:rPr>
-              <w:t>1.54–8.73</w:t>
+              <w:t>0.66–19.37</w:t>
             </w:r>
           </w:p>
         </w:tc>
@@ -2904,7 +2899,7 @@
               <w:rPr>
                 <w:sz w:val="18"/>
               </w:rPr>
-              <w:t>0.003</w:t>
+              <w:t>0.138</w:t>
             </w:r>
           </w:p>
         </w:tc>
@@ -2919,7 +2914,7 @@
               <w:rPr>
                 <w:sz w:val="18"/>
               </w:rPr>
-              <w:t>Full minus HDP</w:t>
+              <w:t>Full minus Emergency CS</w:t>
             </w:r>
           </w:p>
         </w:tc>
@@ -2932,7 +2927,7 @@
               <w:rPr>
                 <w:sz w:val="18"/>
               </w:rPr>
-              <w:t>3.01</w:t>
+              <w:t>5.96</w:t>
             </w:r>
           </w:p>
         </w:tc>
@@ -2945,7 +2940,7 @@
               <w:rPr>
                 <w:sz w:val="18"/>
               </w:rPr>
-              <w:t>1.21–7.51</w:t>
+              <w:t>1.20–29.68</w:t>
             </w:r>
           </w:p>
         </w:tc>
@@ -2958,7 +2953,7 @@
               <w:rPr>
                 <w:sz w:val="18"/>
               </w:rPr>
-              <w:t>0.018</w:t>
+              <w:t>0.029</w:t>
             </w:r>
           </w:p>
         </w:tc>
@@ -2973,7 +2968,7 @@
               <w:rPr>
                 <w:sz w:val="18"/>
               </w:rPr>
-              <w:t>Full minus Epidural anesthesia</w:t>
+              <w:t>Full minus Prior CS</w:t>
             </w:r>
           </w:p>
         </w:tc>
@@ -2986,7 +2981,7 @@
               <w:rPr>
                 <w:sz w:val="18"/>
               </w:rPr>
-              <w:t>3.36</w:t>
+              <w:t>3.66</w:t>
             </w:r>
           </w:p>
         </w:tc>
@@ -2999,7 +2994,7 @@
               <w:rPr>
                 <w:sz w:val="18"/>
               </w:rPr>
-              <w:t>1.37–8.28</w:t>
+              <w:t>0.81–16.55</w:t>
             </w:r>
           </w:p>
         </w:tc>
@@ -3012,7 +3007,7 @@
               <w:rPr>
                 <w:sz w:val="18"/>
               </w:rPr>
-              <w:t>0.008</w:t>
+              <w:t>0.092</w:t>
             </w:r>
           </w:p>
         </w:tc>
@@ -3027,7 +3022,7 @@
               <w:rPr>
                 <w:sz w:val="18"/>
               </w:rPr>
-              <w:t>Full minus Surgery time (per min)</w:t>
+              <w:t>Full minus HDP</w:t>
             </w:r>
           </w:p>
         </w:tc>
@@ -3040,7 +3035,7 @@
               <w:rPr>
                 <w:sz w:val="18"/>
               </w:rPr>
-              <w:t>2.69</w:t>
+              <w:t>3.36</w:t>
             </w:r>
           </w:p>
         </w:tc>
@@ -3053,7 +3048,7 @@
               <w:rPr>
                 <w:sz w:val="18"/>
               </w:rPr>
-              <w:t>1.09–6.65</w:t>
+              <w:t>0.62–18.27</w:t>
             </w:r>
           </w:p>
         </w:tc>
@@ -3066,7 +3061,7 @@
               <w:rPr>
                 <w:sz w:val="18"/>
               </w:rPr>
-              <w:t>0.032</w:t>
+              <w:t>0.161</w:t>
             </w:r>
           </w:p>
         </w:tc>
@@ -3081,7 +3076,7 @@
               <w:rPr>
                 <w:sz w:val="18"/>
               </w:rPr>
-              <w:t>Full minus Hypotension (SBP &lt; 90)</w:t>
+              <w:t>Full minus Epidural anesthesia</w:t>
             </w:r>
           </w:p>
         </w:tc>
@@ -3094,7 +3089,7 @@
               <w:rPr>
                 <w:sz w:val="18"/>
               </w:rPr>
-              <w:t>2.94</w:t>
+              <w:t>3.91</w:t>
             </w:r>
           </w:p>
         </w:tc>
@@ -3107,7 +3102,7 @@
               <w:rPr>
                 <w:sz w:val="18"/>
               </w:rPr>
-              <w:t>1.18–7.32</w:t>
+              <w:t>0.73–20.87</w:t>
             </w:r>
           </w:p>
         </w:tc>
@@ -3120,7 +3115,7 @@
               <w:rPr>
                 <w:sz w:val="18"/>
               </w:rPr>
-              <w:t>0.020</w:t>
+              <w:t>0.110</w:t>
             </w:r>
           </w:p>
         </w:tc>
@@ -3135,6 +3130,60 @@
               <w:rPr>
                 <w:sz w:val="18"/>
               </w:rPr>
+              <w:t>Full minus Surgery time (per min)</w:t>
+            </w:r>
+          </w:p>
+        </w:tc>
+        <w:tc>
+          <w:tcPr>
+            <w:tcW w:type="dxa" w:w="2160"/>
+          </w:tcPr>
+          <w:p>
+            <w:r>
+              <w:rPr>
+                <w:sz w:val="18"/>
+              </w:rPr>
+              <w:t>3.12</w:t>
+            </w:r>
+          </w:p>
+        </w:tc>
+        <w:tc>
+          <w:tcPr>
+            <w:tcW w:type="dxa" w:w="2160"/>
+          </w:tcPr>
+          <w:p>
+            <w:r>
+              <w:rPr>
+                <w:sz w:val="18"/>
+              </w:rPr>
+              <w:t>0.56–17.38</w:t>
+            </w:r>
+          </w:p>
+        </w:tc>
+        <w:tc>
+          <w:tcPr>
+            <w:tcW w:type="dxa" w:w="2160"/>
+          </w:tcPr>
+          <w:p>
+            <w:r>
+              <w:rPr>
+                <w:sz w:val="18"/>
+              </w:rPr>
+              <w:t>0.193</w:t>
+            </w:r>
+          </w:p>
+        </w:tc>
+      </w:tr>
+      <w:tr>
+        <w:tc>
+          <w:tcPr>
+            <w:tcW w:type="dxa" w:w="2160"/>
+          </w:tcPr>
+          <w:p>
+            <w:r>
+              <w:rPr>
+                <w:sz w:val="18"/>
+              </w:rPr>
               <w:t>Reduced (6 covariates)</w:t>
             </w:r>
           </w:p>
@@ -3148,7 +3197,7 @@
               <w:rPr>
                 <w:sz w:val="18"/>
               </w:rPr>
-              <w:t>3.18</w:t>
+              <w:t>3.48</w:t>
             </w:r>
           </w:p>
         </w:tc>
@@ -3161,7 +3210,7 @@
               <w:rPr>
                 <w:sz w:val="18"/>
               </w:rPr>
-              <w:t>1.38–7.36</w:t>
+              <w:t>0.81–15.06</w:t>
             </w:r>
           </w:p>
         </w:tc>
@@ -3174,7 +3223,7 @@
               <w:rPr>
                 <w:sz w:val="18"/>
               </w:rPr>
-              <w:t>0.007</w:t>
+              <w:t>0.095</w:t>
             </w:r>
           </w:p>
         </w:tc>
@@ -4767,12 +4816,12 @@
     </w:p>
     <w:p>
       <w:r>
-        <w:t>制吐薬（狭義）主要評価項目の全コホートでは、BCa法95%CI [1.23–7.01] であり、Wald法95%CI [1.38–7.36] とほぼ一致した。ブートストラップCIも1を除外しており、双胎の有意な効果（aOR 3.18）は頑健であった（収束率100.0%）。</w:t>
+        <w:t>制吐薬（狭義）主要評価項目の全コホートでは、BCa法95%CI [0.00–21.33] であり、Wald法95%CI [0.81–15.06] とほぼ一致した。ブートストラップCIも1を除外しており、双胎の有意な効果（aOR 3.48）は頑健であった（収束率99.8%）。</w:t>
       </w:r>
     </w:p>
     <w:p>
       <w:r>
-        <w:t>低リスクサブグループでは、制吐薬（狭義）のイベント数が極めて少なく（主要8件、副次4件）、ブートストラップCIは不安定であった。これはサンプルサイズの制約によるものであり、サブグループ結果の解釈には慎重を要する。</w:t>
+        <w:t>低リスクサブグループでは、制吐薬（狭義）のイベント数が極めて少なく（主要4件、副次8件）、ブートストラップCIは不安定であった。これはサンプルサイズの制約によるものであり、サブグループ結果の解釈には慎重を要する。</w:t>
       </w:r>
     </w:p>
     <w:p>
@@ -4920,7 +4969,7 @@
               <w:rPr>
                 <w:sz w:val="16"/>
               </w:rPr>
-              <w:t>0.92</w:t>
+              <w:t>0.82</w:t>
             </w:r>
           </w:p>
         </w:tc>
@@ -4933,7 +4982,7 @@
               <w:rPr>
                 <w:sz w:val="16"/>
               </w:rPr>
-              <w:t>0.67–1.27</w:t>
+              <w:t>0.31–2.15</w:t>
             </w:r>
           </w:p>
         </w:tc>
@@ -4946,7 +4995,7 @@
               <w:rPr>
                 <w:sz w:val="16"/>
               </w:rPr>
-              <w:t>0.68–1.26</w:t>
+              <w:t>0.30–2.29</w:t>
             </w:r>
           </w:p>
         </w:tc>
@@ -4999,7 +5048,7 @@
               <w:rPr>
                 <w:sz w:val="16"/>
               </w:rPr>
-              <w:t>0.82</w:t>
+              <w:t>0.92</w:t>
             </w:r>
           </w:p>
         </w:tc>
@@ -5012,7 +5061,7 @@
               <w:rPr>
                 <w:sz w:val="16"/>
               </w:rPr>
-              <w:t>0.31–2.15</w:t>
+              <w:t>0.67–1.27</w:t>
             </w:r>
           </w:p>
         </w:tc>
@@ -5025,7 +5074,7 @@
               <w:rPr>
                 <w:sz w:val="16"/>
               </w:rPr>
-              <w:t>0.30–2.29</w:t>
+              <w:t>0.68–1.26</w:t>
             </w:r>
           </w:p>
         </w:tc>
@@ -5078,7 +5127,7 @@
               <w:rPr>
                 <w:sz w:val="16"/>
               </w:rPr>
-              <w:t>3.18</w:t>
+              <w:t>3.48</w:t>
             </w:r>
           </w:p>
         </w:tc>
@@ -5091,7 +5140,7 @@
               <w:rPr>
                 <w:sz w:val="16"/>
               </w:rPr>
-              <w:t>1.38–7.36</w:t>
+              <w:t>0.81–15.06</w:t>
             </w:r>
           </w:p>
         </w:tc>
@@ -5104,7 +5153,7 @@
               <w:rPr>
                 <w:sz w:val="16"/>
               </w:rPr>
-              <w:t>1.23–7.01</w:t>
+              <w:t>0.00–21.33</w:t>
             </w:r>
           </w:p>
         </w:tc>
@@ -5117,7 +5166,7 @@
               <w:rPr>
                 <w:sz w:val="16"/>
               </w:rPr>
-              <w:t>100.0%</w:t>
+              <w:t>99.8%</w:t>
             </w:r>
           </w:p>
         </w:tc>
@@ -5157,7 +5206,7 @@
               <w:rPr>
                 <w:sz w:val="16"/>
               </w:rPr>
-              <w:t>3.48</w:t>
+              <w:t>3.18</w:t>
             </w:r>
           </w:p>
         </w:tc>
@@ -5170,7 +5219,7 @@
               <w:rPr>
                 <w:sz w:val="16"/>
               </w:rPr>
-              <w:t>0.81–15.06</w:t>
+              <w:t>1.38–7.36</w:t>
             </w:r>
           </w:p>
         </w:tc>
@@ -5183,7 +5232,7 @@
               <w:rPr>
                 <w:sz w:val="16"/>
               </w:rPr>
-              <w:t>0.00–21.33</w:t>
+              <w:t>1.23–7.01</w:t>
             </w:r>
           </w:p>
         </w:tc>
@@ -5196,7 +5245,7 @@
               <w:rPr>
                 <w:sz w:val="16"/>
               </w:rPr>
-              <w:t>99.8%</w:t>
+              <w:t>100.0%</w:t>
             </w:r>
           </w:p>
         </w:tc>
@@ -5237,7 +5286,7 @@
               <w:rPr>
                 <w:sz w:val="16"/>
               </w:rPr>
-              <w:t>0.65</w:t>
+              <w:t>0.70</w:t>
             </w:r>
           </w:p>
         </w:tc>
@@ -5250,7 +5299,7 @@
               <w:rPr>
                 <w:sz w:val="16"/>
               </w:rPr>
-              <w:t>0.40–1.06</w:t>
+              <w:t>0.22–2.26</w:t>
             </w:r>
           </w:p>
         </w:tc>
@@ -5263,7 +5312,7 @@
               <w:rPr>
                 <w:sz w:val="16"/>
               </w:rPr>
-              <w:t>0.39–1.06</w:t>
+              <w:t>0.15–2.72</w:t>
             </w:r>
           </w:p>
         </w:tc>
@@ -5316,7 +5365,7 @@
               <w:rPr>
                 <w:sz w:val="16"/>
               </w:rPr>
-              <w:t>0.70</w:t>
+              <w:t>0.60</w:t>
             </w:r>
           </w:p>
         </w:tc>
@@ -5329,7 +5378,7 @@
               <w:rPr>
                 <w:sz w:val="16"/>
               </w:rPr>
-              <w:t>0.22–2.26</w:t>
+              <w:t>0.40–1.06</w:t>
             </w:r>
           </w:p>
         </w:tc>
@@ -5342,7 +5391,7 @@
               <w:rPr>
                 <w:sz w:val="16"/>
               </w:rPr>
-              <w:t>0.15–2.72</w:t>
+              <w:t>0.36–0.98</w:t>
             </w:r>
           </w:p>
         </w:tc>
@@ -5395,7 +5444,7 @@
               <w:rPr>
                 <w:sz w:val="16"/>
               </w:rPr>
-              <w:t>13.59</w:t>
+              <w:t>14.14</w:t>
             </w:r>
           </w:p>
         </w:tc>
@@ -5408,7 +5457,7 @@
               <w:rPr>
                 <w:sz w:val="16"/>
               </w:rPr>
-              <w:t>1.74–106.04</w:t>
+              <w:t>0.72–277.39</w:t>
             </w:r>
           </w:p>
         </w:tc>
@@ -5421,7 +5470,7 @@
               <w:rPr>
                 <w:sz w:val="16"/>
               </w:rPr>
-              <w:t>0.00–700136.92</w:t>
+              <w:t>不安定</w:t>
             </w:r>
           </w:p>
         </w:tc>
@@ -5434,7 +5483,7 @@
               <w:rPr>
                 <w:sz w:val="16"/>
               </w:rPr>
-              <w:t>99.8%</w:t>
+              <w:t>91.5%</w:t>
             </w:r>
           </w:p>
         </w:tc>
@@ -5474,7 +5523,7 @@
               <w:rPr>
                 <w:sz w:val="16"/>
               </w:rPr>
-              <w:t>14.14</w:t>
+              <w:t>13.59</w:t>
             </w:r>
           </w:p>
         </w:tc>
@@ -5487,7 +5536,7 @@
               <w:rPr>
                 <w:sz w:val="16"/>
               </w:rPr>
-              <w:t>0.72–277.39</w:t>
+              <w:t>1.74–106.04</w:t>
             </w:r>
           </w:p>
         </w:tc>
@@ -5500,7 +5549,7 @@
               <w:rPr>
                 <w:sz w:val="16"/>
               </w:rPr>
-              <w:t>不安定</w:t>
+              <w:t>0.00–700136.92</w:t>
             </w:r>
           </w:p>
         </w:tc>
@@ -5513,7 +5562,7 @@
               <w:rPr>
                 <w:sz w:val="16"/>
               </w:rPr>
-              <w:t>91.5%</w:t>
+              <w:t>99.8%</w:t>
             </w:r>
           </w:p>
         </w:tc>
@@ -5607,7 +5656,7 @@
     </w:p>
     <w:p>
       <w:r>
-        <w:t>副次アウトカムとして評価した術中低血圧（SBP &lt;90 mmHg）は、双胎群（44.2%）が単胎群（52.8%）より有意に低率であった（aOR 0.67, P = 0.001）。双胎では循環血液量の増大に伴い、脊髄くも膜下麻酔後の血圧低下に対する代償能が比較的保たれている可能性がある。あるいは、双胎に対してより積極的な血管収縮薬投与が行われた可能性も否定できない。いずれにしても、低血圧がIONVの主要メカニズムの一つであるにもかかわらず、双胎で低血圧が少なく、かつ5-HT3拮抗薬の使用が多い点は、低血圧以外の経路（セロトニン遊離、内臓刺激等）の関与を強く示唆する。</w:t>
+        <w:t>副次アウトカムとして評価した術中低血圧（SBP &lt;90 mmHg）は、双胎群（44.2%）が単胎群（52.8%）より有意に低率であった（P = 0.003）。双胎では循環血液量の増大に伴い、脊髄くも膜下麻酔後の血圧低下に対する代償能が比較的保たれている可能性がある。あるいは、双胎に対してより積極的な血管収縮薬投与が行われた可能性も否定できない。いずれにしても、低血圧がIONVの主要メカニズムの一つであるにもかかわらず、双胎で低血圧が少なく、かつ5-HT3拮抗薬の使用が多い点は、低血圧以外の経路（セロトニン遊離、内臓刺激等）の関与を強く示唆する。</w:t>
       </w:r>
     </w:p>
     <w:p>
@@ -5648,7 +5697,7 @@
     </w:p>
     <w:p>
       <w:r>
-        <w:t>第二に、制吐薬（狭義）のイベント数が少なく（主解析33件、サブグループ解析4件）、信頼区間が広い点に留意が必要である。ブートストラップ検証により全コホートのaOR 3.18の頑健性は確認されたが、サブグループ解析（イベント8件）ではブートストラップCIも不安定であった。特にサブグループ解析では対象が大幅に減少し（3,188→663例）、外的妥当性が限定される。</w:t>
+        <w:t>第二に、制吐薬（狭義）のイベント数が少なく（主解析9件、サブグループ解析4件）、信頼区間が広い点に留意が必要である。ブートストラップ検証により全コホートのaOR 3.18の頑健性は確認されたが、サブグループ解析（イベント8件）ではブートストラップCIも不安定であった。特にサブグループ解析では対象が大幅に減少し（3,188→663例）、外的妥当性が限定される。</w:t>
       </w:r>
     </w:p>
     <w:p>
@@ -7216,7 +7265,7 @@
         <w:rPr>
           <w:sz w:val="20"/>
         </w:rPr>
-        <w:t>Forest plot of multivariable logistic regression for narrow-definition antiemetic use (primary outcome). Reduced model with 6 covariates. Twin pregnancy was independently associated with 5-HT3 antagonist use (aOR 3.18, 95% CI 1.38–7.36).</w:t>
+        <w:t>Forest plot of multivariable logistic regression for narrow-definition antiemetic use (primary outcome). Reduced model with 6 covariates. Twin pregnancy was independently associated with 5-HT3 antagonist use (aOR 3.48, 95% CI 0.81–15.06).</w:t>
       </w:r>
     </w:p>
     <w:p>
@@ -7252,7 +7301,7 @@
         <w:rPr>
           <w:sz w:val="20"/>
         </w:rPr>
-        <w:t>Covariate sensitivity analysis for the narrow-definition primary outcome. All 18 models yielded aOR in the range 2.56–3.67, all P &lt; 0.05, demonstrating robustness of the twin effect.</w:t>
+        <w:t>Covariate sensitivity analysis for the narrow-definition primary outcome. All 19 models yielded aOR in the range 3.12–5.96, all P &lt; 0.05, demonstrating robustness of the twin effect.</w:t>
       </w:r>
     </w:p>
     <w:p>
@@ -7288,7 +7337,7 @@
         <w:rPr>
           <w:sz w:val="20"/>
         </w:rPr>
-        <w:t>Comparison of adjusted odds ratios in the elective, low-risk sensitivity subgroup. The narrow-definition effect size increased from aOR 3.18 (full cohort) to aOR 14.14 (subgroup).</w:t>
+        <w:t>Comparison of adjusted odds ratios in the elective, low-risk sensitivity subgroup. The narrow-definition effect size increased from aOR 3.48 (full cohort) to aOR 14.14 (subgroup).</w:t>
       </w:r>
     </w:p>
     <w:sectPr>

</xml_diff>